<commit_message>
små rettelser til tekst, fixe bug med 'nulstil' knapper i rapport
</commit_message>
<xml_diff>
--- a/assets/rapport_skabelon.docx
+++ b/assets/rapport_skabelon.docx
@@ -7,7 +7,15 @@
         <w:pStyle w:val="RapportTitel"/>
       </w:pPr>
       <w:r>
-        <w:t>NOTAT – MSL opbygning veje/pladser</w:t>
+        <w:t xml:space="preserve">NOTAT – </w:t>
+      </w:r>
+      <w:proofErr w:type="gramStart"/>
+      <w:r>
+        <w:t>MSL opbygning</w:t>
+      </w:r>
+      <w:proofErr w:type="gramEnd"/>
+      <w:r>
+        <w:t xml:space="preserve"> veje/pladser</w:t>
       </w:r>
     </w:p>
     <w:p>
@@ -32,13 +40,23 @@
         </w:rPr>
         <w:t xml:space="preserve">Projekt: </w:t>
       </w:r>
+      <w:proofErr w:type="gramStart"/>
       <w:r>
         <w:rPr>
           <w:b/>
           <w:sz w:val="32"/>
           <w:szCs w:val="32"/>
         </w:rPr>
-        <w:t>{{ projekt }}</w:t>
+        <w:t>{{ projekt</w:t>
+      </w:r>
+      <w:proofErr w:type="gramEnd"/>
+      <w:r>
+        <w:rPr>
+          <w:b/>
+          <w:sz w:val="32"/>
+          <w:szCs w:val="32"/>
+        </w:rPr>
+        <w:t xml:space="preserve"> }}</w:t>
       </w:r>
     </w:p>
     <w:p>
@@ -62,11 +80,19 @@
         </w:rPr>
         <w:tab/>
       </w:r>
+      <w:proofErr w:type="gramStart"/>
       <w:r>
         <w:rPr>
           <w:bCs/>
         </w:rPr>
-        <w:t>{{ beskrivelse }}</w:t>
+        <w:t>{{ beskrivelse</w:t>
+      </w:r>
+      <w:proofErr w:type="gramEnd"/>
+      <w:r>
+        <w:rPr>
+          <w:bCs/>
+        </w:rPr>
+        <w:t xml:space="preserve"> }}</w:t>
       </w:r>
     </w:p>
     <w:p/>
@@ -86,11 +112,19 @@
         </w:rPr>
         <w:tab/>
       </w:r>
+      <w:proofErr w:type="gramStart"/>
       <w:r>
         <w:rPr>
           <w:bCs/>
         </w:rPr>
-        <w:t>{{ omfang }}</w:t>
+        <w:t>{{ omfang</w:t>
+      </w:r>
+      <w:proofErr w:type="gramEnd"/>
+      <w:r>
+        <w:rPr>
+          <w:bCs/>
+        </w:rPr>
+        <w:t xml:space="preserve"> }}</w:t>
       </w:r>
     </w:p>
     <w:p/>
@@ -110,8 +144,29 @@
         </w:rPr>
         <w:tab/>
       </w:r>
-      <w:r>
-        <w:t>{{ udfoeres_for }}</w:t>
+      <w:proofErr w:type="gramStart"/>
+      <w:r>
+        <w:t xml:space="preserve">{{ </w:t>
+      </w:r>
+      <w:proofErr w:type="spellStart"/>
+      <w:r>
+        <w:t>udfoeres</w:t>
+      </w:r>
+      <w:proofErr w:type="gramEnd"/>
+      <w:r>
+        <w:t>_</w:t>
+      </w:r>
+      <w:proofErr w:type="gramStart"/>
+      <w:r>
+        <w:t>for</w:t>
+      </w:r>
+      <w:proofErr w:type="spellEnd"/>
+      <w:r>
+        <w:t xml:space="preserve"> }</w:t>
+      </w:r>
+      <w:proofErr w:type="gramEnd"/>
+      <w:r>
+        <w:t>}</w:t>
       </w:r>
     </w:p>
     <w:p>
@@ -156,38 +211,84 @@
     </w:p>
     <w:p>
       <w:pPr>
-        <w:spacing w:before="200" w:after="80"/>
         <w:jc w:val="left"/>
         <w:rPr>
-          <w:bCs/>
           <w:i/>
           <w:iCs/>
         </w:rPr>
       </w:pPr>
       <w:r>
         <w:rPr>
-          <w:bCs/>
           <w:i/>
           <w:iCs/>
-          <w:sz w:val="24"/>
         </w:rPr>
         <w:t>Oplyste forudsætninger:</w:t>
       </w:r>
     </w:p>
     <w:p>
       <w:pPr>
+        <w:jc w:val="left"/>
+        <w:rPr>
+          <w:i/>
+          <w:iCs/>
+        </w:rPr>
+      </w:pPr>
+    </w:p>
+    <w:p>
+      <w:pPr>
         <w:pStyle w:val="RapportTitel"/>
         <w:rPr>
           <w:sz w:val="22"/>
           <w:szCs w:val="22"/>
         </w:rPr>
       </w:pPr>
-      <w:r>
-        <w:rPr>
-          <w:sz w:val="22"/>
-          <w:szCs w:val="22"/>
-        </w:rPr>
-        <w:t>{{ tekst_oplyste_forudsaetninger }}</w:t>
+      <w:proofErr w:type="gramStart"/>
+      <w:r>
+        <w:rPr>
+          <w:sz w:val="22"/>
+          <w:szCs w:val="22"/>
+        </w:rPr>
+        <w:t xml:space="preserve">{{ </w:t>
+      </w:r>
+      <w:proofErr w:type="spellStart"/>
+      <w:r>
+        <w:rPr>
+          <w:sz w:val="22"/>
+          <w:szCs w:val="22"/>
+        </w:rPr>
+        <w:t>tekst</w:t>
+      </w:r>
+      <w:proofErr w:type="gramEnd"/>
+      <w:r>
+        <w:rPr>
+          <w:sz w:val="22"/>
+          <w:szCs w:val="22"/>
+        </w:rPr>
+        <w:t>_oplyste_</w:t>
+      </w:r>
+      <w:proofErr w:type="gramStart"/>
+      <w:r>
+        <w:rPr>
+          <w:sz w:val="22"/>
+          <w:szCs w:val="22"/>
+        </w:rPr>
+        <w:t>forudsaetninger</w:t>
+      </w:r>
+      <w:proofErr w:type="spellEnd"/>
+      <w:r>
+        <w:rPr>
+          <w:sz w:val="22"/>
+          <w:szCs w:val="22"/>
+        </w:rPr>
+        <w:t xml:space="preserve"> }</w:t>
+      </w:r>
+      <w:proofErr w:type="gramEnd"/>
+      <w:r>
+        <w:rPr>
+          <w:sz w:val="22"/>
+          <w:szCs w:val="22"/>
+        </w:rPr>
+        <w:t>}</w:t>
       </w:r>
     </w:p>
     <w:p>
@@ -266,7 +367,62 @@
                 <w:szCs w:val="22"/>
                 <w:lang w:val="sv-SE"/>
               </w:rPr>
-              <w:t>{%tr for r in dim_grundlag %}</w:t>
+              <w:t>{%</w:t>
+            </w:r>
+            <w:proofErr w:type="spellStart"/>
+            <w:r>
+              <w:rPr>
+                <w:b/>
+                <w:bCs/>
+                <w:sz w:val="22"/>
+                <w:szCs w:val="22"/>
+                <w:lang w:val="sv-SE"/>
+              </w:rPr>
+              <w:t>tr</w:t>
+            </w:r>
+            <w:proofErr w:type="spellEnd"/>
+            <w:r>
+              <w:rPr>
+                <w:b/>
+                <w:bCs/>
+                <w:sz w:val="22"/>
+                <w:szCs w:val="22"/>
+                <w:lang w:val="sv-SE"/>
+              </w:rPr>
+              <w:t xml:space="preserve"> for r in </w:t>
+            </w:r>
+            <w:proofErr w:type="spellStart"/>
+            <w:r>
+              <w:rPr>
+                <w:b/>
+                <w:bCs/>
+                <w:sz w:val="22"/>
+                <w:szCs w:val="22"/>
+                <w:lang w:val="sv-SE"/>
+              </w:rPr>
+              <w:t>dim_grundlag</w:t>
+            </w:r>
+            <w:proofErr w:type="spellEnd"/>
+            <w:r>
+              <w:rPr>
+                <w:b/>
+                <w:bCs/>
+                <w:sz w:val="22"/>
+                <w:szCs w:val="22"/>
+                <w:lang w:val="sv-SE"/>
+              </w:rPr>
+              <w:t xml:space="preserve"> </w:t>
+            </w:r>
+            <w:proofErr w:type="gramStart"/>
+            <w:r>
+              <w:rPr>
+                <w:b/>
+                <w:bCs/>
+                <w:sz w:val="22"/>
+                <w:szCs w:val="22"/>
+                <w:lang w:val="sv-SE"/>
+              </w:rPr>
+              <w:t>%}</w:t>
             </w:r>
             <w:r>
               <w:rPr>
@@ -276,7 +432,40 @@
                 <w:szCs w:val="22"/>
                 <w:lang w:val="sv-SE"/>
               </w:rPr>
-              <w:t>{{ r.label }}</w:t>
+              <w:t xml:space="preserve">{{ </w:t>
+            </w:r>
+            <w:proofErr w:type="spellStart"/>
+            <w:r>
+              <w:rPr>
+                <w:b/>
+                <w:bCs/>
+                <w:sz w:val="22"/>
+                <w:szCs w:val="22"/>
+                <w:lang w:val="sv-SE"/>
+              </w:rPr>
+              <w:t>r</w:t>
+            </w:r>
+            <w:proofErr w:type="gramEnd"/>
+            <w:r>
+              <w:rPr>
+                <w:b/>
+                <w:bCs/>
+                <w:sz w:val="22"/>
+                <w:szCs w:val="22"/>
+                <w:lang w:val="sv-SE"/>
+              </w:rPr>
+              <w:t>.label</w:t>
+            </w:r>
+            <w:proofErr w:type="spellEnd"/>
+            <w:r>
+              <w:rPr>
+                <w:b/>
+                <w:bCs/>
+                <w:sz w:val="22"/>
+                <w:szCs w:val="22"/>
+                <w:lang w:val="sv-SE"/>
+              </w:rPr>
+              <w:t xml:space="preserve"> }}</w:t>
             </w:r>
           </w:p>
         </w:tc>
@@ -293,13 +482,95 @@
                 <w:lang w:val="sv-SE"/>
               </w:rPr>
             </w:pPr>
+            <w:proofErr w:type="gramStart"/>
             <w:r>
               <w:rPr>
                 <w:sz w:val="22"/>
                 <w:szCs w:val="22"/>
                 <w:lang w:val="sv-SE"/>
               </w:rPr>
-              <w:t>{{ r.vaerdi }}{%tr endfor %}</w:t>
+              <w:t xml:space="preserve">{{ </w:t>
+            </w:r>
+            <w:proofErr w:type="spellStart"/>
+            <w:r>
+              <w:rPr>
+                <w:sz w:val="22"/>
+                <w:szCs w:val="22"/>
+                <w:lang w:val="sv-SE"/>
+              </w:rPr>
+              <w:t>r</w:t>
+            </w:r>
+            <w:proofErr w:type="gramEnd"/>
+            <w:r>
+              <w:rPr>
+                <w:sz w:val="22"/>
+                <w:szCs w:val="22"/>
+                <w:lang w:val="sv-SE"/>
+              </w:rPr>
+              <w:t>.</w:t>
+            </w:r>
+            <w:proofErr w:type="gramStart"/>
+            <w:r>
+              <w:rPr>
+                <w:sz w:val="22"/>
+                <w:szCs w:val="22"/>
+                <w:lang w:val="sv-SE"/>
+              </w:rPr>
+              <w:t>vaerdi</w:t>
+            </w:r>
+            <w:proofErr w:type="spellEnd"/>
+            <w:r>
+              <w:rPr>
+                <w:sz w:val="22"/>
+                <w:szCs w:val="22"/>
+                <w:lang w:val="sv-SE"/>
+              </w:rPr>
+              <w:t xml:space="preserve"> }}{</w:t>
+            </w:r>
+            <w:proofErr w:type="gramEnd"/>
+            <w:r>
+              <w:rPr>
+                <w:sz w:val="22"/>
+                <w:szCs w:val="22"/>
+                <w:lang w:val="sv-SE"/>
+              </w:rPr>
+              <w:t>%</w:t>
+            </w:r>
+            <w:proofErr w:type="spellStart"/>
+            <w:r>
+              <w:rPr>
+                <w:sz w:val="22"/>
+                <w:szCs w:val="22"/>
+                <w:lang w:val="sv-SE"/>
+              </w:rPr>
+              <w:t>tr</w:t>
+            </w:r>
+            <w:proofErr w:type="spellEnd"/>
+            <w:r>
+              <w:rPr>
+                <w:sz w:val="22"/>
+                <w:szCs w:val="22"/>
+                <w:lang w:val="sv-SE"/>
+              </w:rPr>
+              <w:t xml:space="preserve"> </w:t>
+            </w:r>
+            <w:proofErr w:type="spellStart"/>
+            <w:r>
+              <w:rPr>
+                <w:sz w:val="22"/>
+                <w:szCs w:val="22"/>
+                <w:lang w:val="sv-SE"/>
+              </w:rPr>
+              <w:t>endfor</w:t>
+            </w:r>
+            <w:proofErr w:type="spellEnd"/>
+            <w:r>
+              <w:rPr>
+                <w:sz w:val="22"/>
+                <w:szCs w:val="22"/>
+                <w:lang w:val="sv-SE"/>
+              </w:rPr>
+              <w:t xml:space="preserve"> %}</w:t>
             </w:r>
           </w:p>
         </w:tc>
@@ -326,7 +597,21 @@
         <w:rPr>
           <w:b/>
         </w:rPr>
-        <w:t>Generelle dimensioneringsforudsætninger for MSL opbygning:</w:t>
+        <w:t xml:space="preserve">Generelle dimensioneringsforudsætninger for </w:t>
+      </w:r>
+      <w:proofErr w:type="gramStart"/>
+      <w:r>
+        <w:rPr>
+          <w:b/>
+        </w:rPr>
+        <w:t>MSL opbygning</w:t>
+      </w:r>
+      <w:proofErr w:type="gramEnd"/>
+      <w:r>
+        <w:rPr>
+          <w:b/>
+        </w:rPr>
+        <w:t>:</w:t>
       </w:r>
     </w:p>
     <w:p>
@@ -337,12 +622,53 @@
           <w:szCs w:val="22"/>
         </w:rPr>
       </w:pPr>
-      <w:r>
-        <w:rPr>
-          <w:sz w:val="22"/>
-          <w:szCs w:val="22"/>
-        </w:rPr>
-        <w:t>{{ tekst_generelle_forudsaetninger }}</w:t>
+      <w:proofErr w:type="gramStart"/>
+      <w:r>
+        <w:rPr>
+          <w:sz w:val="22"/>
+          <w:szCs w:val="22"/>
+        </w:rPr>
+        <w:t xml:space="preserve">{{ </w:t>
+      </w:r>
+      <w:proofErr w:type="spellStart"/>
+      <w:r>
+        <w:rPr>
+          <w:sz w:val="22"/>
+          <w:szCs w:val="22"/>
+        </w:rPr>
+        <w:t>tekst</w:t>
+      </w:r>
+      <w:proofErr w:type="gramEnd"/>
+      <w:r>
+        <w:rPr>
+          <w:sz w:val="22"/>
+          <w:szCs w:val="22"/>
+        </w:rPr>
+        <w:t>_generelle_</w:t>
+      </w:r>
+      <w:proofErr w:type="gramStart"/>
+      <w:r>
+        <w:rPr>
+          <w:sz w:val="22"/>
+          <w:szCs w:val="22"/>
+        </w:rPr>
+        <w:t>forudsaetninger</w:t>
+      </w:r>
+      <w:proofErr w:type="spellEnd"/>
+      <w:r>
+        <w:rPr>
+          <w:sz w:val="22"/>
+          <w:szCs w:val="22"/>
+        </w:rPr>
+        <w:t xml:space="preserve"> }</w:t>
+      </w:r>
+      <w:proofErr w:type="gramEnd"/>
+      <w:r>
+        <w:rPr>
+          <w:sz w:val="22"/>
+          <w:szCs w:val="22"/>
+        </w:rPr>
+        <w:t>}</w:t>
       </w:r>
     </w:p>
     <w:p>
@@ -385,7 +711,15 @@
         <w:jc w:val="left"/>
       </w:pPr>
       <w:r>
-        <w:t>Baseret på ovennævnte indgangsparametre kan vi foreslå følgende MSL opbygning:</w:t>
+        <w:t xml:space="preserve">Baseret på ovennævnte indgangsparametre kan vi foreslå følgende </w:t>
+      </w:r>
+      <w:proofErr w:type="gramStart"/>
+      <w:r>
+        <w:t>MSL opbygning</w:t>
+      </w:r>
+      <w:proofErr w:type="gramEnd"/>
+      <w:r>
+        <w:t>:</w:t>
       </w:r>
     </w:p>
     <w:p>
@@ -435,7 +769,73 @@
                 <w:szCs w:val="22"/>
                 <w:lang w:val="en-US"/>
               </w:rPr>
-              <w:t>{%tr for r in dim_resultat %}{{ r.label}}</w:t>
+              <w:t xml:space="preserve">{%tr for r in </w:t>
+            </w:r>
+            <w:proofErr w:type="spellStart"/>
+            <w:r>
+              <w:rPr>
+                <w:b/>
+                <w:bCs/>
+                <w:sz w:val="22"/>
+                <w:szCs w:val="22"/>
+                <w:lang w:val="en-US"/>
+              </w:rPr>
+              <w:t>dim_resultat</w:t>
+            </w:r>
+            <w:proofErr w:type="spellEnd"/>
+            <w:r>
+              <w:rPr>
+                <w:b/>
+                <w:bCs/>
+                <w:sz w:val="22"/>
+                <w:szCs w:val="22"/>
+                <w:lang w:val="en-US"/>
+              </w:rPr>
+              <w:t xml:space="preserve"> </w:t>
+            </w:r>
+            <w:proofErr w:type="gramStart"/>
+            <w:r>
+              <w:rPr>
+                <w:b/>
+                <w:bCs/>
+                <w:sz w:val="22"/>
+                <w:szCs w:val="22"/>
+                <w:lang w:val="en-US"/>
+              </w:rPr>
+              <w:t xml:space="preserve">%}{{ </w:t>
+            </w:r>
+            <w:proofErr w:type="spellStart"/>
+            <w:r>
+              <w:rPr>
+                <w:b/>
+                <w:bCs/>
+                <w:sz w:val="22"/>
+                <w:szCs w:val="22"/>
+                <w:lang w:val="en-US"/>
+              </w:rPr>
+              <w:t>r</w:t>
+            </w:r>
+            <w:proofErr w:type="gramEnd"/>
+            <w:r>
+              <w:rPr>
+                <w:b/>
+                <w:bCs/>
+                <w:sz w:val="22"/>
+                <w:szCs w:val="22"/>
+                <w:lang w:val="en-US"/>
+              </w:rPr>
+              <w:t>.label</w:t>
+            </w:r>
+            <w:proofErr w:type="spellEnd"/>
+            <w:r>
+              <w:rPr>
+                <w:b/>
+                <w:bCs/>
+                <w:sz w:val="22"/>
+                <w:szCs w:val="22"/>
+                <w:lang w:val="en-US"/>
+              </w:rPr>
+              <w:t>}}</w:t>
             </w:r>
           </w:p>
         </w:tc>
@@ -452,13 +852,50 @@
                 <w:lang w:val="en-US"/>
               </w:rPr>
             </w:pPr>
+            <w:proofErr w:type="gramStart"/>
             <w:r>
               <w:rPr>
                 <w:sz w:val="22"/>
                 <w:szCs w:val="22"/>
                 <w:lang w:val="en-US"/>
               </w:rPr>
-              <w:t>{{ r.vaerdi }}</w:t>
+              <w:t xml:space="preserve">{{ </w:t>
+            </w:r>
+            <w:proofErr w:type="spellStart"/>
+            <w:r>
+              <w:rPr>
+                <w:sz w:val="22"/>
+                <w:szCs w:val="22"/>
+                <w:lang w:val="en-US"/>
+              </w:rPr>
+              <w:t>r</w:t>
+            </w:r>
+            <w:proofErr w:type="gramEnd"/>
+            <w:r>
+              <w:rPr>
+                <w:sz w:val="22"/>
+                <w:szCs w:val="22"/>
+                <w:lang w:val="en-US"/>
+              </w:rPr>
+              <w:t>.</w:t>
+            </w:r>
+            <w:proofErr w:type="gramStart"/>
+            <w:r>
+              <w:rPr>
+                <w:sz w:val="22"/>
+                <w:szCs w:val="22"/>
+                <w:lang w:val="en-US"/>
+              </w:rPr>
+              <w:t>vaerdi</w:t>
+            </w:r>
+            <w:proofErr w:type="spellEnd"/>
+            <w:r>
+              <w:rPr>
+                <w:sz w:val="22"/>
+                <w:szCs w:val="22"/>
+                <w:lang w:val="en-US"/>
+              </w:rPr>
+              <w:t xml:space="preserve"> }}</w:t>
             </w:r>
             <w:r>
               <w:rPr>
@@ -466,7 +903,34 @@
                 <w:szCs w:val="22"/>
                 <w:lang w:val="en-US"/>
               </w:rPr>
-              <w:t>{%tr endfor %}</w:t>
+              <w:t>{</w:t>
+            </w:r>
+            <w:proofErr w:type="gramEnd"/>
+            <w:r>
+              <w:rPr>
+                <w:sz w:val="22"/>
+                <w:szCs w:val="22"/>
+                <w:lang w:val="en-US"/>
+              </w:rPr>
+              <w:t xml:space="preserve">%tr </w:t>
+            </w:r>
+            <w:proofErr w:type="spellStart"/>
+            <w:r>
+              <w:rPr>
+                <w:sz w:val="22"/>
+                <w:szCs w:val="22"/>
+                <w:lang w:val="en-US"/>
+              </w:rPr>
+              <w:t>endfor</w:t>
+            </w:r>
+            <w:proofErr w:type="spellEnd"/>
+            <w:r>
+              <w:rPr>
+                <w:sz w:val="22"/>
+                <w:szCs w:val="22"/>
+                <w:lang w:val="en-US"/>
+              </w:rPr>
+              <w:t xml:space="preserve"> %}</w:t>
             </w:r>
           </w:p>
         </w:tc>
@@ -491,13 +955,33 @@
           <w:lang w:val="en-US"/>
         </w:rPr>
       </w:pPr>
+      <w:proofErr w:type="gramStart"/>
       <w:r>
         <w:rPr>
           <w:sz w:val="22"/>
           <w:szCs w:val="22"/>
           <w:lang w:val="en-US"/>
         </w:rPr>
-        <w:t>{{ visualisering }}</w:t>
+        <w:t xml:space="preserve">{{ </w:t>
+      </w:r>
+      <w:proofErr w:type="spellStart"/>
+      <w:r>
+        <w:rPr>
+          <w:sz w:val="22"/>
+          <w:szCs w:val="22"/>
+          <w:lang w:val="en-US"/>
+        </w:rPr>
+        <w:t>visualisering</w:t>
+      </w:r>
+      <w:proofErr w:type="spellEnd"/>
+      <w:proofErr w:type="gramEnd"/>
+      <w:r>
+        <w:rPr>
+          <w:sz w:val="22"/>
+          <w:szCs w:val="22"/>
+          <w:lang w:val="en-US"/>
+        </w:rPr>
+        <w:t xml:space="preserve"> }}</w:t>
       </w:r>
     </w:p>
     <w:p>
@@ -529,8 +1013,9 @@
           <w:szCs w:val="22"/>
           <w:lang w:val="en-US"/>
         </w:rPr>
-        <w:t>Krav til komprimering</w:t>
-      </w:r>
+        <w:t xml:space="preserve">Krav </w:t>
+      </w:r>
+      <w:proofErr w:type="spellStart"/>
       <w:r>
         <w:rPr>
           <w:b/>
@@ -539,231 +1024,478 @@
           <w:szCs w:val="22"/>
           <w:lang w:val="en-US"/>
         </w:rPr>
-        <w:t>:</w:t>
-      </w:r>
-    </w:p>
-    <w:p>
-      <w:pPr>
-        <w:pStyle w:val="RapportTitel"/>
-        <w:rPr>
-          <w:sz w:val="22"/>
-          <w:szCs w:val="22"/>
-        </w:rPr>
-      </w:pPr>
-      <w:r>
-        <w:rPr>
-          <w:sz w:val="22"/>
-          <w:szCs w:val="22"/>
-        </w:rPr>
-        <w:t>{{ tekst_krav_komprimering }}</w:t>
-      </w:r>
-    </w:p>
-    <w:p>
-      <w:pPr>
-        <w:pStyle w:val="RapportTitel"/>
-        <w:rPr>
-          <w:sz w:val="22"/>
-          <w:szCs w:val="22"/>
-        </w:rPr>
-      </w:pPr>
-    </w:p>
-    <w:p>
-      <w:pPr>
-        <w:pStyle w:val="RapportTitel"/>
+        <w:t>til</w:t>
+      </w:r>
+      <w:proofErr w:type="spellEnd"/>
+      <w:r>
         <w:rPr>
           <w:b/>
           <w:bCs/>
           <w:sz w:val="22"/>
           <w:szCs w:val="22"/>
-        </w:rPr>
-      </w:pPr>
+          <w:lang w:val="en-US"/>
+        </w:rPr>
+        <w:t xml:space="preserve"> </w:t>
+      </w:r>
+      <w:proofErr w:type="spellStart"/>
       <w:r>
         <w:rPr>
           <w:b/>
           <w:bCs/>
           <w:sz w:val="22"/>
           <w:szCs w:val="22"/>
-        </w:rPr>
-        <w:t>Dimensionering og sikkerhed:</w:t>
-      </w:r>
-    </w:p>
-    <w:p>
-      <w:pPr>
-        <w:pStyle w:val="RapportTitel"/>
-        <w:rPr>
-          <w:sz w:val="22"/>
-          <w:szCs w:val="22"/>
-        </w:rPr>
-      </w:pPr>
-      <w:r>
-        <w:rPr>
-          <w:sz w:val="22"/>
-          <w:szCs w:val="22"/>
-        </w:rPr>
-        <w:t>{{ tekst_dim_sikkerhed }}</w:t>
-      </w:r>
-    </w:p>
-    <w:p>
-      <w:pPr>
-        <w:pStyle w:val="RapportTitel"/>
-        <w:rPr>
-          <w:sz w:val="22"/>
-          <w:szCs w:val="22"/>
-        </w:rPr>
-      </w:pPr>
-    </w:p>
-    <w:p>
-      <w:pPr>
-        <w:pStyle w:val="RapportTitel"/>
+          <w:lang w:val="en-US"/>
+        </w:rPr>
+        <w:t>komprimering</w:t>
+      </w:r>
+      <w:proofErr w:type="spellEnd"/>
+      <w:r>
         <w:rPr>
           <w:b/>
           <w:bCs/>
           <w:sz w:val="22"/>
           <w:szCs w:val="22"/>
-        </w:rPr>
-      </w:pPr>
-      <w:r>
+          <w:lang w:val="en-US"/>
+        </w:rPr>
+        <w:t>:</w:t>
+      </w:r>
+    </w:p>
+    <w:p>
+      <w:pPr>
+        <w:pStyle w:val="RapportTitel"/>
+        <w:rPr>
+          <w:sz w:val="22"/>
+          <w:szCs w:val="22"/>
+        </w:rPr>
+      </w:pPr>
+      <w:proofErr w:type="gramStart"/>
+      <w:r>
+        <w:rPr>
+          <w:sz w:val="22"/>
+          <w:szCs w:val="22"/>
+        </w:rPr>
+        <w:t xml:space="preserve">{{ </w:t>
+      </w:r>
+      <w:proofErr w:type="spellStart"/>
+      <w:r>
+        <w:rPr>
+          <w:sz w:val="22"/>
+          <w:szCs w:val="22"/>
+        </w:rPr>
+        <w:t>tekst</w:t>
+      </w:r>
+      <w:proofErr w:type="gramEnd"/>
+      <w:r>
+        <w:rPr>
+          <w:sz w:val="22"/>
+          <w:szCs w:val="22"/>
+        </w:rPr>
+        <w:t>_krav_</w:t>
+      </w:r>
+      <w:proofErr w:type="gramStart"/>
+      <w:r>
+        <w:rPr>
+          <w:sz w:val="22"/>
+          <w:szCs w:val="22"/>
+        </w:rPr>
+        <w:t>komprimering</w:t>
+      </w:r>
+      <w:proofErr w:type="spellEnd"/>
+      <w:r>
+        <w:rPr>
+          <w:sz w:val="22"/>
+          <w:szCs w:val="22"/>
+        </w:rPr>
+        <w:t xml:space="preserve"> }</w:t>
+      </w:r>
+      <w:proofErr w:type="gramEnd"/>
+      <w:r>
+        <w:rPr>
+          <w:sz w:val="22"/>
+          <w:szCs w:val="22"/>
+        </w:rPr>
+        <w:t>}</w:t>
+      </w:r>
+    </w:p>
+    <w:p>
+      <w:pPr>
+        <w:pStyle w:val="RapportTitel"/>
+        <w:rPr>
+          <w:sz w:val="22"/>
+          <w:szCs w:val="22"/>
+        </w:rPr>
+      </w:pPr>
+    </w:p>
+    <w:p>
+      <w:pPr>
+        <w:pStyle w:val="RapportTitel"/>
         <w:rPr>
           <w:b/>
           <w:bCs/>
           <w:sz w:val="22"/>
           <w:szCs w:val="22"/>
         </w:rPr>
-        <w:t>Udførelse:</w:t>
-      </w:r>
-    </w:p>
-    <w:p>
-      <w:pPr>
-        <w:pStyle w:val="RapportTitel"/>
-        <w:rPr>
-          <w:sz w:val="22"/>
-          <w:szCs w:val="22"/>
-        </w:rPr>
-      </w:pPr>
-      <w:r>
-        <w:rPr>
-          <w:sz w:val="22"/>
-          <w:szCs w:val="22"/>
-        </w:rPr>
-        <w:t>{{ tekst_udfoerelse }}</w:t>
-      </w:r>
-    </w:p>
-    <w:p>
-      <w:pPr>
-        <w:pStyle w:val="RapportTitel"/>
-        <w:rPr>
-          <w:sz w:val="22"/>
-          <w:szCs w:val="22"/>
-        </w:rPr>
-      </w:pPr>
-    </w:p>
-    <w:p>
-      <w:pPr>
-        <w:pStyle w:val="RapportTitel"/>
+      </w:pPr>
+      <w:r>
         <w:rPr>
           <w:b/>
           <w:bCs/>
           <w:sz w:val="22"/>
           <w:szCs w:val="22"/>
         </w:rPr>
-      </w:pPr>
-      <w:r>
+        <w:t>Dimensionering og sikkerhed:</w:t>
+      </w:r>
+    </w:p>
+    <w:p>
+      <w:pPr>
+        <w:pStyle w:val="RapportTitel"/>
+        <w:rPr>
+          <w:sz w:val="22"/>
+          <w:szCs w:val="22"/>
+        </w:rPr>
+      </w:pPr>
+      <w:proofErr w:type="gramStart"/>
+      <w:r>
+        <w:rPr>
+          <w:sz w:val="22"/>
+          <w:szCs w:val="22"/>
+        </w:rPr>
+        <w:t xml:space="preserve">{{ </w:t>
+      </w:r>
+      <w:proofErr w:type="spellStart"/>
+      <w:r>
+        <w:rPr>
+          <w:sz w:val="22"/>
+          <w:szCs w:val="22"/>
+        </w:rPr>
+        <w:t>tekst</w:t>
+      </w:r>
+      <w:proofErr w:type="gramEnd"/>
+      <w:r>
+        <w:rPr>
+          <w:sz w:val="22"/>
+          <w:szCs w:val="22"/>
+        </w:rPr>
+        <w:t>_dim_</w:t>
+      </w:r>
+      <w:proofErr w:type="gramStart"/>
+      <w:r>
+        <w:rPr>
+          <w:sz w:val="22"/>
+          <w:szCs w:val="22"/>
+        </w:rPr>
+        <w:t>sikkerhed</w:t>
+      </w:r>
+      <w:proofErr w:type="spellEnd"/>
+      <w:r>
+        <w:rPr>
+          <w:sz w:val="22"/>
+          <w:szCs w:val="22"/>
+        </w:rPr>
+        <w:t xml:space="preserve"> }</w:t>
+      </w:r>
+      <w:proofErr w:type="gramEnd"/>
+      <w:r>
+        <w:rPr>
+          <w:sz w:val="22"/>
+          <w:szCs w:val="22"/>
+        </w:rPr>
+        <w:t>}</w:t>
+      </w:r>
+    </w:p>
+    <w:p>
+      <w:pPr>
+        <w:pStyle w:val="RapportTitel"/>
+        <w:rPr>
+          <w:sz w:val="22"/>
+          <w:szCs w:val="22"/>
+        </w:rPr>
+      </w:pPr>
+    </w:p>
+    <w:p>
+      <w:pPr>
+        <w:pStyle w:val="RapportTitel"/>
         <w:rPr>
           <w:b/>
           <w:bCs/>
           <w:sz w:val="22"/>
           <w:szCs w:val="22"/>
         </w:rPr>
-        <w:t>Kontrolplan:</w:t>
-      </w:r>
-    </w:p>
-    <w:p>
-      <w:pPr>
-        <w:pStyle w:val="RapportTitel"/>
-        <w:rPr>
-          <w:sz w:val="22"/>
-          <w:szCs w:val="22"/>
-        </w:rPr>
-      </w:pPr>
-      <w:r>
-        <w:rPr>
-          <w:sz w:val="22"/>
-          <w:szCs w:val="22"/>
-        </w:rPr>
-        <w:t>{{ tekst_kontrolplan }}</w:t>
-      </w:r>
-    </w:p>
-    <w:p>
-      <w:pPr>
-        <w:pStyle w:val="RapportTitel"/>
-        <w:rPr>
-          <w:sz w:val="22"/>
-          <w:szCs w:val="22"/>
-        </w:rPr>
-      </w:pPr>
-    </w:p>
-    <w:p>
-      <w:pPr>
-        <w:pStyle w:val="RapportTitel"/>
+      </w:pPr>
+      <w:r>
         <w:rPr>
           <w:b/>
           <w:bCs/>
           <w:sz w:val="22"/>
           <w:szCs w:val="22"/>
         </w:rPr>
-      </w:pPr>
-      <w:r>
+        <w:t>Udførelse:</w:t>
+      </w:r>
+    </w:p>
+    <w:p>
+      <w:pPr>
+        <w:pStyle w:val="RapportTitel"/>
+        <w:rPr>
+          <w:sz w:val="22"/>
+          <w:szCs w:val="22"/>
+        </w:rPr>
+      </w:pPr>
+      <w:proofErr w:type="gramStart"/>
+      <w:r>
+        <w:rPr>
+          <w:sz w:val="22"/>
+          <w:szCs w:val="22"/>
+        </w:rPr>
+        <w:t xml:space="preserve">{{ </w:t>
+      </w:r>
+      <w:proofErr w:type="spellStart"/>
+      <w:r>
+        <w:rPr>
+          <w:sz w:val="22"/>
+          <w:szCs w:val="22"/>
+        </w:rPr>
+        <w:t>tekst</w:t>
+      </w:r>
+      <w:proofErr w:type="gramEnd"/>
+      <w:r>
+        <w:rPr>
+          <w:sz w:val="22"/>
+          <w:szCs w:val="22"/>
+        </w:rPr>
+        <w:t>_</w:t>
+      </w:r>
+      <w:proofErr w:type="gramStart"/>
+      <w:r>
+        <w:rPr>
+          <w:sz w:val="22"/>
+          <w:szCs w:val="22"/>
+        </w:rPr>
+        <w:t>udfoerelse</w:t>
+      </w:r>
+      <w:proofErr w:type="spellEnd"/>
+      <w:r>
+        <w:rPr>
+          <w:sz w:val="22"/>
+          <w:szCs w:val="22"/>
+        </w:rPr>
+        <w:t xml:space="preserve"> }</w:t>
+      </w:r>
+      <w:proofErr w:type="gramEnd"/>
+      <w:r>
+        <w:rPr>
+          <w:sz w:val="22"/>
+          <w:szCs w:val="22"/>
+        </w:rPr>
+        <w:t>}</w:t>
+      </w:r>
+    </w:p>
+    <w:p>
+      <w:pPr>
+        <w:pStyle w:val="RapportTitel"/>
+        <w:rPr>
+          <w:sz w:val="22"/>
+          <w:szCs w:val="22"/>
+        </w:rPr>
+      </w:pPr>
+    </w:p>
+    <w:p>
+      <w:pPr>
+        <w:pStyle w:val="RapportTitel"/>
         <w:rPr>
           <w:b/>
           <w:bCs/>
           <w:sz w:val="22"/>
           <w:szCs w:val="22"/>
         </w:rPr>
-        <w:t>Projekteringsansvar</w:t>
-      </w:r>
-    </w:p>
-    <w:p>
-      <w:pPr>
-        <w:pStyle w:val="RapportTitel"/>
-        <w:rPr>
-          <w:sz w:val="22"/>
-          <w:szCs w:val="22"/>
-        </w:rPr>
-      </w:pPr>
-      <w:r>
-        <w:rPr>
-          <w:sz w:val="22"/>
-          <w:szCs w:val="22"/>
-        </w:rPr>
-        <w:t>{{ tekst_projekteringsansvar }}</w:t>
-      </w:r>
-    </w:p>
-    <w:p>
-      <w:pPr>
-        <w:pStyle w:val="RapportTitel"/>
-        <w:rPr>
-          <w:sz w:val="22"/>
-          <w:szCs w:val="22"/>
-        </w:rPr>
-      </w:pPr>
-    </w:p>
-    <w:p>
-      <w:pPr>
-        <w:pStyle w:val="RapportTitel"/>
+      </w:pPr>
+      <w:r>
         <w:rPr>
           <w:b/>
           <w:bCs/>
           <w:sz w:val="22"/>
           <w:szCs w:val="22"/>
         </w:rPr>
-      </w:pPr>
-      <w:r>
+        <w:t>Kontrolplan:</w:t>
+      </w:r>
+    </w:p>
+    <w:p>
+      <w:pPr>
+        <w:pStyle w:val="RapportTitel"/>
+        <w:rPr>
+          <w:sz w:val="22"/>
+          <w:szCs w:val="22"/>
+        </w:rPr>
+      </w:pPr>
+      <w:proofErr w:type="gramStart"/>
+      <w:r>
+        <w:rPr>
+          <w:sz w:val="22"/>
+          <w:szCs w:val="22"/>
+        </w:rPr>
+        <w:t xml:space="preserve">{{ </w:t>
+      </w:r>
+      <w:proofErr w:type="spellStart"/>
+      <w:r>
+        <w:rPr>
+          <w:sz w:val="22"/>
+          <w:szCs w:val="22"/>
+        </w:rPr>
+        <w:t>tekst</w:t>
+      </w:r>
+      <w:proofErr w:type="gramEnd"/>
+      <w:r>
+        <w:rPr>
+          <w:sz w:val="22"/>
+          <w:szCs w:val="22"/>
+        </w:rPr>
+        <w:t>_</w:t>
+      </w:r>
+      <w:proofErr w:type="gramStart"/>
+      <w:r>
+        <w:rPr>
+          <w:sz w:val="22"/>
+          <w:szCs w:val="22"/>
+        </w:rPr>
+        <w:t>kontrolplan</w:t>
+      </w:r>
+      <w:proofErr w:type="spellEnd"/>
+      <w:r>
+        <w:rPr>
+          <w:sz w:val="22"/>
+          <w:szCs w:val="22"/>
+        </w:rPr>
+        <w:t xml:space="preserve"> }</w:t>
+      </w:r>
+      <w:proofErr w:type="gramEnd"/>
+      <w:r>
+        <w:rPr>
+          <w:sz w:val="22"/>
+          <w:szCs w:val="22"/>
+        </w:rPr>
+        <w:t>}</w:t>
+      </w:r>
+    </w:p>
+    <w:p>
+      <w:pPr>
+        <w:pStyle w:val="RapportTitel"/>
+        <w:rPr>
+          <w:sz w:val="22"/>
+          <w:szCs w:val="22"/>
+        </w:rPr>
+      </w:pPr>
+    </w:p>
+    <w:p>
+      <w:pPr>
+        <w:pStyle w:val="RapportTitel"/>
         <w:rPr>
           <w:b/>
           <w:bCs/>
           <w:sz w:val="22"/>
           <w:szCs w:val="22"/>
         </w:rPr>
+      </w:pPr>
+      <w:r>
+        <w:rPr>
+          <w:b/>
+          <w:bCs/>
+          <w:sz w:val="22"/>
+          <w:szCs w:val="22"/>
+        </w:rPr>
+        <w:t>Projekteringsansvar</w:t>
+      </w:r>
+      <w:r>
+        <w:rPr>
+          <w:b/>
+          <w:bCs/>
+          <w:sz w:val="22"/>
+          <w:szCs w:val="22"/>
+        </w:rPr>
+        <w:t>:</w:t>
+      </w:r>
+    </w:p>
+    <w:p>
+      <w:pPr>
+        <w:pStyle w:val="RapportTitel"/>
+        <w:rPr>
+          <w:sz w:val="22"/>
+          <w:szCs w:val="22"/>
+        </w:rPr>
+      </w:pPr>
+      <w:proofErr w:type="gramStart"/>
+      <w:r>
+        <w:rPr>
+          <w:sz w:val="22"/>
+          <w:szCs w:val="22"/>
+        </w:rPr>
+        <w:t xml:space="preserve">{{ </w:t>
+      </w:r>
+      <w:proofErr w:type="spellStart"/>
+      <w:r>
+        <w:rPr>
+          <w:sz w:val="22"/>
+          <w:szCs w:val="22"/>
+        </w:rPr>
+        <w:t>tekst</w:t>
+      </w:r>
+      <w:proofErr w:type="gramEnd"/>
+      <w:r>
+        <w:rPr>
+          <w:sz w:val="22"/>
+          <w:szCs w:val="22"/>
+        </w:rPr>
+        <w:t>_</w:t>
+      </w:r>
+      <w:proofErr w:type="gramStart"/>
+      <w:r>
+        <w:rPr>
+          <w:sz w:val="22"/>
+          <w:szCs w:val="22"/>
+        </w:rPr>
+        <w:t>projekteringsansvar</w:t>
+      </w:r>
+      <w:proofErr w:type="spellEnd"/>
+      <w:r>
+        <w:rPr>
+          <w:sz w:val="22"/>
+          <w:szCs w:val="22"/>
+        </w:rPr>
+        <w:t xml:space="preserve"> }</w:t>
+      </w:r>
+      <w:proofErr w:type="gramEnd"/>
+      <w:r>
+        <w:rPr>
+          <w:sz w:val="22"/>
+          <w:szCs w:val="22"/>
+        </w:rPr>
+        <w:t>}</w:t>
+      </w:r>
+    </w:p>
+    <w:p>
+      <w:pPr>
+        <w:pStyle w:val="RapportTitel"/>
+        <w:rPr>
+          <w:sz w:val="22"/>
+          <w:szCs w:val="22"/>
+        </w:rPr>
+      </w:pPr>
+    </w:p>
+    <w:p>
+      <w:pPr>
+        <w:pStyle w:val="RapportTitel"/>
+        <w:rPr>
+          <w:b/>
+          <w:bCs/>
+          <w:sz w:val="22"/>
+          <w:szCs w:val="22"/>
+        </w:rPr>
+      </w:pPr>
+      <w:r>
+        <w:rPr>
+          <w:b/>
+          <w:bCs/>
+          <w:sz w:val="22"/>
+          <w:szCs w:val="22"/>
+        </w:rPr>
         <w:lastRenderedPageBreak/>
         <w:t>Odense</w:t>
       </w:r>
@@ -785,12 +1517,21 @@
         </w:rPr>
         <w:t xml:space="preserve"> </w:t>
       </w:r>
-      <w:r>
-        <w:rPr>
-          <w:sz w:val="22"/>
-          <w:szCs w:val="22"/>
-        </w:rPr>
-        <w:t>{{ dato }}</w:t>
+      <w:proofErr w:type="gramStart"/>
+      <w:r>
+        <w:rPr>
+          <w:sz w:val="22"/>
+          <w:szCs w:val="22"/>
+        </w:rPr>
+        <w:t>{{ dato</w:t>
+      </w:r>
+      <w:proofErr w:type="gramEnd"/>
+      <w:r>
+        <w:rPr>
+          <w:sz w:val="22"/>
+          <w:szCs w:val="22"/>
+        </w:rPr>
+        <w:t xml:space="preserve"> }}</w:t>
       </w:r>
     </w:p>
     <w:p>
@@ -810,12 +1551,21 @@
           <w:szCs w:val="22"/>
         </w:rPr>
       </w:pPr>
-      <w:r>
-        <w:rPr>
-          <w:sz w:val="22"/>
-          <w:szCs w:val="22"/>
-        </w:rPr>
-        <w:t>{{ sagsbehandler }}</w:t>
+      <w:proofErr w:type="gramStart"/>
+      <w:r>
+        <w:rPr>
+          <w:sz w:val="22"/>
+          <w:szCs w:val="22"/>
+        </w:rPr>
+        <w:t>{{ sagsbehandler</w:t>
+      </w:r>
+      <w:proofErr w:type="gramEnd"/>
+      <w:r>
+        <w:rPr>
+          <w:sz w:val="22"/>
+          <w:szCs w:val="22"/>
+        </w:rPr>
+        <w:t xml:space="preserve"> }}</w:t>
       </w:r>
     </w:p>
     <w:p>
@@ -826,12 +1576,53 @@
           <w:szCs w:val="22"/>
         </w:rPr>
       </w:pPr>
-      <w:r>
-        <w:rPr>
-          <w:sz w:val="22"/>
-          <w:szCs w:val="22"/>
-        </w:rPr>
-        <w:t>{{ sagsbehandler_mail }}</w:t>
+      <w:proofErr w:type="gramStart"/>
+      <w:r>
+        <w:rPr>
+          <w:sz w:val="22"/>
+          <w:szCs w:val="22"/>
+        </w:rPr>
+        <w:t xml:space="preserve">{{ </w:t>
+      </w:r>
+      <w:proofErr w:type="spellStart"/>
+      <w:r>
+        <w:rPr>
+          <w:sz w:val="22"/>
+          <w:szCs w:val="22"/>
+        </w:rPr>
+        <w:t>sagsbehandler</w:t>
+      </w:r>
+      <w:proofErr w:type="gramEnd"/>
+      <w:r>
+        <w:rPr>
+          <w:sz w:val="22"/>
+          <w:szCs w:val="22"/>
+        </w:rPr>
+        <w:t>_</w:t>
+      </w:r>
+      <w:proofErr w:type="gramStart"/>
+      <w:r>
+        <w:rPr>
+          <w:sz w:val="22"/>
+          <w:szCs w:val="22"/>
+        </w:rPr>
+        <w:t>mail</w:t>
+      </w:r>
+      <w:proofErr w:type="spellEnd"/>
+      <w:r>
+        <w:rPr>
+          <w:sz w:val="22"/>
+          <w:szCs w:val="22"/>
+        </w:rPr>
+        <w:t xml:space="preserve"> }</w:t>
+      </w:r>
+      <w:proofErr w:type="gramEnd"/>
+      <w:r>
+        <w:rPr>
+          <w:sz w:val="22"/>
+          <w:szCs w:val="22"/>
+        </w:rPr>
+        <w:t>}</w:t>
       </w:r>
     </w:p>
     <w:sectPr>
@@ -1064,6 +1855,7 @@
                             </w:rPr>
                             <w:t xml:space="preserve">BG Byggros A/S | </w:t>
                           </w:r>
+                          <w:proofErr w:type="spellStart"/>
                           <w:r>
                             <w:rPr>
                               <w:rFonts w:ascii="HelveticaNeueLTStd-Roman" w:hAnsi="HelveticaNeueLTStd-Roman" w:cs="HelveticaNeueLTStd-Roman"/>
@@ -1072,7 +1864,18 @@
                               <w:szCs w:val="18"/>
                               <w:lang w:val="en-US"/>
                             </w:rPr>
-                            <w:t xml:space="preserve">Østbirkvej </w:t>
+                            <w:t>Østbirkvej</w:t>
+                          </w:r>
+                          <w:proofErr w:type="spellEnd"/>
+                          <w:r>
+                            <w:rPr>
+                              <w:rFonts w:ascii="HelveticaNeueLTStd-Roman" w:hAnsi="HelveticaNeueLTStd-Roman" w:cs="HelveticaNeueLTStd-Roman"/>
+                              <w:color w:val="FFFFFF" w:themeColor="background1"/>
+                              <w:sz w:val="18"/>
+                              <w:szCs w:val="18"/>
+                              <w:lang w:val="en-US"/>
+                            </w:rPr>
+                            <w:t xml:space="preserve"> </w:t>
                           </w:r>
                           <w:r>
                             <w:rPr>
@@ -1132,7 +1935,29 @@
                               <w:szCs w:val="18"/>
                               <w:lang w:val="en-US"/>
                             </w:rPr>
-                            <w:t xml:space="preserve"> | Tlf. 5948 9000 | </w:t>
+                            <w:t xml:space="preserve"> | </w:t>
+                          </w:r>
+                          <w:proofErr w:type="spellStart"/>
+                          <w:r>
+                            <w:rPr>
+                              <w:rFonts w:ascii="HelveticaNeueLTStd-Roman" w:hAnsi="HelveticaNeueLTStd-Roman" w:cs="HelveticaNeueLTStd-Roman"/>
+                              <w:color w:val="FFFFFF" w:themeColor="background1"/>
+                              <w:sz w:val="18"/>
+                              <w:szCs w:val="18"/>
+                              <w:lang w:val="en-US"/>
+                            </w:rPr>
+                            <w:t>Tlf</w:t>
+                          </w:r>
+                          <w:proofErr w:type="spellEnd"/>
+                          <w:r>
+                            <w:rPr>
+                              <w:rFonts w:ascii="HelveticaNeueLTStd-Roman" w:hAnsi="HelveticaNeueLTStd-Roman" w:cs="HelveticaNeueLTStd-Roman"/>
+                              <w:color w:val="FFFFFF" w:themeColor="background1"/>
+                              <w:sz w:val="18"/>
+                              <w:szCs w:val="18"/>
+                              <w:lang w:val="en-US"/>
+                            </w:rPr>
+                            <w:t xml:space="preserve">. 5948 9000 | </w:t>
                           </w:r>
                           <w:r>
                             <w:rPr>
@@ -1211,6 +2036,7 @@
                       </w:rPr>
                       <w:t xml:space="preserve">BG Byggros A/S | </w:t>
                     </w:r>
+                    <w:proofErr w:type="spellStart"/>
                     <w:r>
                       <w:rPr>
                         <w:rFonts w:ascii="HelveticaNeueLTStd-Roman" w:hAnsi="HelveticaNeueLTStd-Roman" w:cs="HelveticaNeueLTStd-Roman"/>
@@ -1219,7 +2045,18 @@
                         <w:szCs w:val="18"/>
                         <w:lang w:val="en-US"/>
                       </w:rPr>
-                      <w:t xml:space="preserve">Østbirkvej </w:t>
+                      <w:t>Østbirkvej</w:t>
+                    </w:r>
+                    <w:proofErr w:type="spellEnd"/>
+                    <w:r>
+                      <w:rPr>
+                        <w:rFonts w:ascii="HelveticaNeueLTStd-Roman" w:hAnsi="HelveticaNeueLTStd-Roman" w:cs="HelveticaNeueLTStd-Roman"/>
+                        <w:color w:val="FFFFFF" w:themeColor="background1"/>
+                        <w:sz w:val="18"/>
+                        <w:szCs w:val="18"/>
+                        <w:lang w:val="en-US"/>
+                      </w:rPr>
+                      <w:t xml:space="preserve"> </w:t>
                     </w:r>
                     <w:r>
                       <w:rPr>
@@ -1279,7 +2116,29 @@
                         <w:szCs w:val="18"/>
                         <w:lang w:val="en-US"/>
                       </w:rPr>
-                      <w:t xml:space="preserve"> | Tlf. 5948 9000 | </w:t>
+                      <w:t xml:space="preserve"> | </w:t>
+                    </w:r>
+                    <w:proofErr w:type="spellStart"/>
+                    <w:r>
+                      <w:rPr>
+                        <w:rFonts w:ascii="HelveticaNeueLTStd-Roman" w:hAnsi="HelveticaNeueLTStd-Roman" w:cs="HelveticaNeueLTStd-Roman"/>
+                        <w:color w:val="FFFFFF" w:themeColor="background1"/>
+                        <w:sz w:val="18"/>
+                        <w:szCs w:val="18"/>
+                        <w:lang w:val="en-US"/>
+                      </w:rPr>
+                      <w:t>Tlf</w:t>
+                    </w:r>
+                    <w:proofErr w:type="spellEnd"/>
+                    <w:r>
+                      <w:rPr>
+                        <w:rFonts w:ascii="HelveticaNeueLTStd-Roman" w:hAnsi="HelveticaNeueLTStd-Roman" w:cs="HelveticaNeueLTStd-Roman"/>
+                        <w:color w:val="FFFFFF" w:themeColor="background1"/>
+                        <w:sz w:val="18"/>
+                        <w:szCs w:val="18"/>
+                        <w:lang w:val="en-US"/>
+                      </w:rPr>
+                      <w:t xml:space="preserve">. 5948 9000 | </w:t>
                     </w:r>
                     <w:r>
                       <w:rPr>

</xml_diff>

<commit_message>
rette visualisering og rapportskabelon
</commit_message>
<xml_diff>
--- a/assets/rapport_skabelon.docx
+++ b/assets/rapport_skabelon.docx
@@ -340,13 +340,13 @@
         <w:tblLook w:val="04A0" w:firstRow="1" w:lastRow="0" w:firstColumn="1" w:lastColumn="0" w:noHBand="0" w:noVBand="1"/>
       </w:tblPr>
       <w:tblGrid>
-        <w:gridCol w:w="4814"/>
-        <w:gridCol w:w="4814"/>
+        <w:gridCol w:w="3964"/>
+        <w:gridCol w:w="5664"/>
       </w:tblGrid>
       <w:tr>
         <w:tc>
           <w:tcPr>
-            <w:tcW w:w="4814" w:type="dxa"/>
+            <w:tcW w:w="3964" w:type="dxa"/>
           </w:tcPr>
           <w:p>
             <w:pPr>
@@ -471,7 +471,7 @@
         </w:tc>
         <w:tc>
           <w:tcPr>
-            <w:tcW w:w="4814" w:type="dxa"/>
+            <w:tcW w:w="5664" w:type="dxa"/>
           </w:tcPr>
           <w:p>
             <w:pPr>
@@ -742,13 +742,13 @@
         <w:tblLook w:val="04A0" w:firstRow="1" w:lastRow="0" w:firstColumn="1" w:lastColumn="0" w:noHBand="0" w:noVBand="1"/>
       </w:tblPr>
       <w:tblGrid>
-        <w:gridCol w:w="4814"/>
-        <w:gridCol w:w="4814"/>
+        <w:gridCol w:w="3964"/>
+        <w:gridCol w:w="5664"/>
       </w:tblGrid>
       <w:tr>
         <w:tc>
           <w:tcPr>
-            <w:tcW w:w="4814" w:type="dxa"/>
+            <w:tcW w:w="3964" w:type="dxa"/>
           </w:tcPr>
           <w:p>
             <w:pPr>
@@ -841,7 +841,7 @@
         </w:tc>
         <w:tc>
           <w:tcPr>
-            <w:tcW w:w="4814" w:type="dxa"/>
+            <w:tcW w:w="5664" w:type="dxa"/>
           </w:tcPr>
           <w:p>
             <w:pPr>
@@ -3582,15 +3582,21 @@
 </file>
 
 <file path=customXml/item1.xml><?xml version="1.0" encoding="utf-8"?>
-<?mso-contentType ?>
-<FormTemplates xmlns="http://schemas.microsoft.com/sharepoint/v3/contenttype/forms">
-  <Display>DocumentLibraryForm</Display>
-  <Edit>DocumentLibraryForm</Edit>
-  <New>DocumentLibraryForm</New>
-</FormTemplates>
+<p:properties xmlns:p="http://schemas.microsoft.com/office/2006/metadata/properties" xmlns:xsi="http://www.w3.org/2001/XMLSchema-instance" xmlns:pc="http://schemas.microsoft.com/office/infopath/2007/PartnerControls">
+  <documentManagement>
+    <TaxCatchAll xmlns="41c9fafd-c058-44f8-b2ce-53cd3afba157" xsi:nil="true"/>
+    <lcf76f155ced4ddcb4097134ff3c332f xmlns="3c9f7625-f508-4699-980b-15a788d55c32">
+      <Terms xmlns="http://schemas.microsoft.com/office/infopath/2007/PartnerControls"/>
+    </lcf76f155ced4ddcb4097134ff3c332f>
+  </documentManagement>
+</p:properties>
 </file>
 
 <file path=customXml/item2.xml><?xml version="1.0" encoding="utf-8"?>
+<b:Sources xmlns:b="http://schemas.openxmlformats.org/officeDocument/2006/bibliography" xmlns="http://schemas.openxmlformats.org/officeDocument/2006/bibliography" SelectedStyle="\APASixthEditionOfficeOnline.xsl" StyleName="APA" Version="6"/>
+</file>
+
+<file path=customXml/item3.xml><?xml version="1.0" encoding="utf-8"?>
 <ct:contentTypeSchema xmlns:ct="http://schemas.microsoft.com/office/2006/metadata/contentType" xmlns:ma="http://schemas.microsoft.com/office/2006/metadata/properties/metaAttributes" ct:_="" ma:_="" ma:contentTypeName="Document" ma:contentTypeID="0x010100A8CC43999E69B146B21FD7037336070D" ma:contentTypeVersion="19" ma:contentTypeDescription="Create a new document." ma:contentTypeScope="" ma:versionID="da949df7407854784e825555ef0470b6">
   <xsd:schema xmlns:xsd="http://www.w3.org/2001/XMLSchema" xmlns:xs="http://www.w3.org/2001/XMLSchema" xmlns:p="http://schemas.microsoft.com/office/2006/metadata/properties" xmlns:ns2="3c9f7625-f508-4699-980b-15a788d55c32" xmlns:ns3="41c9fafd-c058-44f8-b2ce-53cd3afba157" targetNamespace="http://schemas.microsoft.com/office/2006/metadata/properties" ma:root="true" ma:fieldsID="15818a7baaa05f324ff0ec0f28430cf1" ns2:_="" ns3:_="">
     <xsd:import namespace="3c9f7625-f508-4699-980b-15a788d55c32"/>
@@ -3851,30 +3857,35 @@
 </ct:contentTypeSchema>
 </file>
 
-<file path=customXml/item3.xml><?xml version="1.0" encoding="utf-8"?>
-<b:Sources xmlns:b="http://schemas.openxmlformats.org/officeDocument/2006/bibliography" xmlns="http://schemas.openxmlformats.org/officeDocument/2006/bibliography" SelectedStyle="\APASixthEditionOfficeOnline.xsl" StyleName="APA" Version="6"/>
-</file>
-
 <file path=customXml/item4.xml><?xml version="1.0" encoding="utf-8"?>
-<p:properties xmlns:p="http://schemas.microsoft.com/office/2006/metadata/properties" xmlns:xsi="http://www.w3.org/2001/XMLSchema-instance" xmlns:pc="http://schemas.microsoft.com/office/infopath/2007/PartnerControls">
-  <documentManagement>
-    <TaxCatchAll xmlns="41c9fafd-c058-44f8-b2ce-53cd3afba157" xsi:nil="true"/>
-    <lcf76f155ced4ddcb4097134ff3c332f xmlns="3c9f7625-f508-4699-980b-15a788d55c32">
-      <Terms xmlns="http://schemas.microsoft.com/office/infopath/2007/PartnerControls"/>
-    </lcf76f155ced4ddcb4097134ff3c332f>
-  </documentManagement>
-</p:properties>
+<?mso-contentType ?>
+<FormTemplates xmlns="http://schemas.microsoft.com/sharepoint/v3/contenttype/forms">
+  <Display>DocumentLibraryForm</Display>
+  <Edit>DocumentLibraryForm</Edit>
+  <New>DocumentLibraryForm</New>
+</FormTemplates>
 </file>
 
 <file path=customXml/itemProps1.xml><?xml version="1.0" encoding="utf-8"?>
-<ds:datastoreItem xmlns:ds="http://schemas.openxmlformats.org/officeDocument/2006/customXml" ds:itemID="{7F7F3EE4-B827-46F8-9B41-1867DA03D8C0}">
+<ds:datastoreItem xmlns:ds="http://schemas.openxmlformats.org/officeDocument/2006/customXml" ds:itemID="{DB34630C-6632-4F4A-8401-0B3C3F129E00}">
   <ds:schemaRefs>
-    <ds:schemaRef ds:uri="http://schemas.microsoft.com/sharepoint/v3/contenttype/forms"/>
+    <ds:schemaRef ds:uri="http://schemas.microsoft.com/office/2006/metadata/properties"/>
+    <ds:schemaRef ds:uri="http://schemas.microsoft.com/office/infopath/2007/PartnerControls"/>
+    <ds:schemaRef ds:uri="41c9fafd-c058-44f8-b2ce-53cd3afba157"/>
+    <ds:schemaRef ds:uri="3c9f7625-f508-4699-980b-15a788d55c32"/>
   </ds:schemaRefs>
 </ds:datastoreItem>
 </file>
 
 <file path=customXml/itemProps2.xml><?xml version="1.0" encoding="utf-8"?>
+<ds:datastoreItem xmlns:ds="http://schemas.openxmlformats.org/officeDocument/2006/customXml" ds:itemID="{1C0F4396-7414-4761-9E29-1E7CA0E9432A}">
+  <ds:schemaRefs>
+    <ds:schemaRef ds:uri="http://schemas.openxmlformats.org/officeDocument/2006/bibliography"/>
+  </ds:schemaRefs>
+</ds:datastoreItem>
+</file>
+
+<file path=customXml/itemProps3.xml><?xml version="1.0" encoding="utf-8"?>
 <ds:datastoreItem xmlns:ds="http://schemas.openxmlformats.org/officeDocument/2006/customXml" ds:itemID="{3110F94B-FA03-43C1-B03B-8B3B4671D0EF}">
   <ds:schemaRefs>
     <ds:schemaRef ds:uri="http://schemas.microsoft.com/office/2006/metadata/contentType"/>
@@ -3893,21 +3904,10 @@
 </ds:datastoreItem>
 </file>
 
-<file path=customXml/itemProps3.xml><?xml version="1.0" encoding="utf-8"?>
-<ds:datastoreItem xmlns:ds="http://schemas.openxmlformats.org/officeDocument/2006/customXml" ds:itemID="{1C0F4396-7414-4761-9E29-1E7CA0E9432A}">
+<file path=customXml/itemProps4.xml><?xml version="1.0" encoding="utf-8"?>
+<ds:datastoreItem xmlns:ds="http://schemas.openxmlformats.org/officeDocument/2006/customXml" ds:itemID="{7F7F3EE4-B827-46F8-9B41-1867DA03D8C0}">
   <ds:schemaRefs>
-    <ds:schemaRef ds:uri="http://schemas.openxmlformats.org/officeDocument/2006/bibliography"/>
-  </ds:schemaRefs>
-</ds:datastoreItem>
-</file>
-
-<file path=customXml/itemProps4.xml><?xml version="1.0" encoding="utf-8"?>
-<ds:datastoreItem xmlns:ds="http://schemas.openxmlformats.org/officeDocument/2006/customXml" ds:itemID="{DB34630C-6632-4F4A-8401-0B3C3F129E00}">
-  <ds:schemaRefs>
-    <ds:schemaRef ds:uri="http://schemas.microsoft.com/office/2006/metadata/properties"/>
-    <ds:schemaRef ds:uri="http://schemas.microsoft.com/office/infopath/2007/PartnerControls"/>
-    <ds:schemaRef ds:uri="41c9fafd-c058-44f8-b2ce-53cd3afba157"/>
-    <ds:schemaRef ds:uri="3c9f7625-f508-4699-980b-15a788d55c32"/>
+    <ds:schemaRef ds:uri="http://schemas.microsoft.com/sharepoint/v3/contenttype/forms"/>
   </ds:schemaRefs>
 </ds:datastoreItem>
 </file>
</xml_diff>

<commit_message>
ret rapport visualisering + tilføj generering af designdiagram
</commit_message>
<xml_diff>
--- a/assets/rapport_skabelon.docx
+++ b/assets/rapport_skabelon.docx
@@ -998,11 +998,58 @@
       <w:pPr>
         <w:pStyle w:val="RapportTitel"/>
         <w:rPr>
+          <w:sz w:val="22"/>
+          <w:szCs w:val="22"/>
+          <w:lang w:val="en-US"/>
+        </w:rPr>
+      </w:pPr>
+      <w:proofErr w:type="gramStart"/>
+      <w:r>
+        <w:rPr>
+          <w:sz w:val="22"/>
+          <w:szCs w:val="22"/>
+          <w:lang w:val="en-US"/>
+        </w:rPr>
+        <w:t xml:space="preserve">{{ </w:t>
+      </w:r>
+      <w:proofErr w:type="spellStart"/>
+      <w:r>
+        <w:rPr>
+          <w:sz w:val="22"/>
+          <w:szCs w:val="22"/>
+          <w:lang w:val="en-US"/>
+        </w:rPr>
+        <w:t>designdiagram</w:t>
+      </w:r>
+      <w:proofErr w:type="spellEnd"/>
+      <w:proofErr w:type="gramEnd"/>
+      <w:r>
+        <w:rPr>
+          <w:sz w:val="22"/>
+          <w:szCs w:val="22"/>
+          <w:lang w:val="en-US"/>
+        </w:rPr>
+        <w:t xml:space="preserve"> }}</w:t>
+      </w:r>
+    </w:p>
+    <w:p>
+      <w:pPr>
+        <w:pStyle w:val="RapportTitel"/>
+        <w:rPr>
+          <w:sz w:val="22"/>
+          <w:szCs w:val="22"/>
+          <w:lang w:val="en-US"/>
+        </w:rPr>
+      </w:pPr>
+    </w:p>
+    <w:p>
+      <w:pPr>
+        <w:pStyle w:val="RapportTitel"/>
+        <w:rPr>
           <w:b/>
           <w:bCs/>
           <w:sz w:val="22"/>
           <w:szCs w:val="22"/>
-          <w:lang w:val="en-US"/>
         </w:rPr>
       </w:pPr>
       <w:r>
@@ -1011,303 +1058,362 @@
           <w:bCs/>
           <w:sz w:val="22"/>
           <w:szCs w:val="22"/>
-          <w:lang w:val="en-US"/>
-        </w:rPr>
-        <w:t xml:space="preserve">Krav </w:t>
-      </w:r>
-      <w:proofErr w:type="spellStart"/>
+        </w:rPr>
+        <w:t>Krav til komprimering</w:t>
+      </w:r>
       <w:r>
         <w:rPr>
           <w:b/>
           <w:bCs/>
           <w:sz w:val="22"/>
           <w:szCs w:val="22"/>
-          <w:lang w:val="en-US"/>
-        </w:rPr>
-        <w:t>til</w:t>
+        </w:rPr>
+        <w:t>:</w:t>
+      </w:r>
+    </w:p>
+    <w:p>
+      <w:pPr>
+        <w:pStyle w:val="RapportTitel"/>
+        <w:rPr>
+          <w:sz w:val="22"/>
+          <w:szCs w:val="22"/>
+        </w:rPr>
+      </w:pPr>
+      <w:proofErr w:type="gramStart"/>
+      <w:r>
+        <w:rPr>
+          <w:sz w:val="22"/>
+          <w:szCs w:val="22"/>
+        </w:rPr>
+        <w:t xml:space="preserve">{{ </w:t>
+      </w:r>
+      <w:proofErr w:type="spellStart"/>
+      <w:r>
+        <w:rPr>
+          <w:sz w:val="22"/>
+          <w:szCs w:val="22"/>
+        </w:rPr>
+        <w:t>tekst</w:t>
+      </w:r>
+      <w:proofErr w:type="gramEnd"/>
+      <w:r>
+        <w:rPr>
+          <w:sz w:val="22"/>
+          <w:szCs w:val="22"/>
+        </w:rPr>
+        <w:t>_krav_</w:t>
+      </w:r>
+      <w:proofErr w:type="gramStart"/>
+      <w:r>
+        <w:rPr>
+          <w:sz w:val="22"/>
+          <w:szCs w:val="22"/>
+        </w:rPr>
+        <w:t>komprimering</w:t>
       </w:r>
       <w:proofErr w:type="spellEnd"/>
       <w:r>
+        <w:rPr>
+          <w:sz w:val="22"/>
+          <w:szCs w:val="22"/>
+        </w:rPr>
+        <w:t xml:space="preserve"> }</w:t>
+      </w:r>
+      <w:proofErr w:type="gramEnd"/>
+      <w:r>
+        <w:rPr>
+          <w:sz w:val="22"/>
+          <w:szCs w:val="22"/>
+        </w:rPr>
+        <w:t>}</w:t>
+      </w:r>
+    </w:p>
+    <w:p>
+      <w:pPr>
+        <w:pStyle w:val="RapportTitel"/>
+        <w:rPr>
+          <w:sz w:val="22"/>
+          <w:szCs w:val="22"/>
+        </w:rPr>
+      </w:pPr>
+    </w:p>
+    <w:p>
+      <w:pPr>
+        <w:pStyle w:val="RapportTitel"/>
         <w:rPr>
           <w:b/>
           <w:bCs/>
           <w:sz w:val="22"/>
           <w:szCs w:val="22"/>
-          <w:lang w:val="en-US"/>
-        </w:rPr>
-        <w:t xml:space="preserve"> </w:t>
-      </w:r>
-      <w:proofErr w:type="spellStart"/>
+        </w:rPr>
+      </w:pPr>
       <w:r>
         <w:rPr>
           <w:b/>
           <w:bCs/>
           <w:sz w:val="22"/>
           <w:szCs w:val="22"/>
-          <w:lang w:val="en-US"/>
-        </w:rPr>
-        <w:t>komprimering</w:t>
+        </w:rPr>
+        <w:t>Dimensionering og sikkerhed:</w:t>
+      </w:r>
+    </w:p>
+    <w:p>
+      <w:pPr>
+        <w:pStyle w:val="RapportTitel"/>
+        <w:rPr>
+          <w:sz w:val="22"/>
+          <w:szCs w:val="22"/>
+        </w:rPr>
+      </w:pPr>
+      <w:proofErr w:type="gramStart"/>
+      <w:r>
+        <w:rPr>
+          <w:sz w:val="22"/>
+          <w:szCs w:val="22"/>
+        </w:rPr>
+        <w:t xml:space="preserve">{{ </w:t>
+      </w:r>
+      <w:proofErr w:type="spellStart"/>
+      <w:r>
+        <w:rPr>
+          <w:sz w:val="22"/>
+          <w:szCs w:val="22"/>
+        </w:rPr>
+        <w:t>tekst</w:t>
+      </w:r>
+      <w:proofErr w:type="gramEnd"/>
+      <w:r>
+        <w:rPr>
+          <w:sz w:val="22"/>
+          <w:szCs w:val="22"/>
+        </w:rPr>
+        <w:t>_dim_</w:t>
+      </w:r>
+      <w:proofErr w:type="gramStart"/>
+      <w:r>
+        <w:rPr>
+          <w:sz w:val="22"/>
+          <w:szCs w:val="22"/>
+        </w:rPr>
+        <w:t>sikkerhed</w:t>
       </w:r>
       <w:proofErr w:type="spellEnd"/>
       <w:r>
+        <w:rPr>
+          <w:sz w:val="22"/>
+          <w:szCs w:val="22"/>
+        </w:rPr>
+        <w:t xml:space="preserve"> }</w:t>
+      </w:r>
+      <w:proofErr w:type="gramEnd"/>
+      <w:r>
+        <w:rPr>
+          <w:sz w:val="22"/>
+          <w:szCs w:val="22"/>
+        </w:rPr>
+        <w:t>}</w:t>
+      </w:r>
+    </w:p>
+    <w:p>
+      <w:pPr>
+        <w:pStyle w:val="RapportTitel"/>
+        <w:rPr>
+          <w:sz w:val="22"/>
+          <w:szCs w:val="22"/>
+        </w:rPr>
+      </w:pPr>
+    </w:p>
+    <w:p>
+      <w:pPr>
+        <w:pStyle w:val="RapportTitel"/>
         <w:rPr>
           <w:b/>
           <w:bCs/>
           <w:sz w:val="22"/>
           <w:szCs w:val="22"/>
-          <w:lang w:val="en-US"/>
-        </w:rPr>
-        <w:t>:</w:t>
-      </w:r>
-    </w:p>
-    <w:p>
-      <w:pPr>
-        <w:pStyle w:val="RapportTitel"/>
-        <w:rPr>
-          <w:sz w:val="22"/>
-          <w:szCs w:val="22"/>
-        </w:rPr>
-      </w:pPr>
-      <w:proofErr w:type="gramStart"/>
-      <w:r>
-        <w:rPr>
-          <w:sz w:val="22"/>
-          <w:szCs w:val="22"/>
-        </w:rPr>
-        <w:t xml:space="preserve">{{ </w:t>
-      </w:r>
-      <w:proofErr w:type="spellStart"/>
-      <w:r>
-        <w:rPr>
-          <w:sz w:val="22"/>
-          <w:szCs w:val="22"/>
-        </w:rPr>
-        <w:t>tekst</w:t>
-      </w:r>
-      <w:proofErr w:type="gramEnd"/>
-      <w:r>
-        <w:rPr>
-          <w:sz w:val="22"/>
-          <w:szCs w:val="22"/>
-        </w:rPr>
-        <w:t>_krav_</w:t>
-      </w:r>
-      <w:proofErr w:type="gramStart"/>
-      <w:r>
-        <w:rPr>
-          <w:sz w:val="22"/>
-          <w:szCs w:val="22"/>
-        </w:rPr>
-        <w:t>komprimering</w:t>
-      </w:r>
-      <w:proofErr w:type="spellEnd"/>
-      <w:r>
-        <w:rPr>
-          <w:sz w:val="22"/>
-          <w:szCs w:val="22"/>
-        </w:rPr>
-        <w:t xml:space="preserve"> }</w:t>
-      </w:r>
-      <w:proofErr w:type="gramEnd"/>
-      <w:r>
-        <w:rPr>
-          <w:sz w:val="22"/>
-          <w:szCs w:val="22"/>
-        </w:rPr>
-        <w:t>}</w:t>
-      </w:r>
-    </w:p>
-    <w:p>
-      <w:pPr>
-        <w:pStyle w:val="RapportTitel"/>
-        <w:rPr>
-          <w:sz w:val="22"/>
-          <w:szCs w:val="22"/>
-        </w:rPr>
-      </w:pPr>
-    </w:p>
-    <w:p>
-      <w:pPr>
-        <w:pStyle w:val="RapportTitel"/>
+        </w:rPr>
+      </w:pPr>
+      <w:r>
         <w:rPr>
           <w:b/>
           <w:bCs/>
           <w:sz w:val="22"/>
           <w:szCs w:val="22"/>
         </w:rPr>
-      </w:pPr>
-      <w:r>
+        <w:t>Udførelse:</w:t>
+      </w:r>
+    </w:p>
+    <w:p>
+      <w:pPr>
+        <w:pStyle w:val="RapportTitel"/>
+        <w:rPr>
+          <w:sz w:val="22"/>
+          <w:szCs w:val="22"/>
+        </w:rPr>
+      </w:pPr>
+      <w:proofErr w:type="gramStart"/>
+      <w:r>
+        <w:rPr>
+          <w:sz w:val="22"/>
+          <w:szCs w:val="22"/>
+        </w:rPr>
+        <w:t xml:space="preserve">{{ </w:t>
+      </w:r>
+      <w:proofErr w:type="spellStart"/>
+      <w:r>
+        <w:rPr>
+          <w:sz w:val="22"/>
+          <w:szCs w:val="22"/>
+        </w:rPr>
+        <w:t>tekst</w:t>
+      </w:r>
+      <w:proofErr w:type="gramEnd"/>
+      <w:r>
+        <w:rPr>
+          <w:sz w:val="22"/>
+          <w:szCs w:val="22"/>
+        </w:rPr>
+        <w:t>_</w:t>
+      </w:r>
+      <w:proofErr w:type="gramStart"/>
+      <w:r>
+        <w:rPr>
+          <w:sz w:val="22"/>
+          <w:szCs w:val="22"/>
+        </w:rPr>
+        <w:t>udfoerelse</w:t>
+      </w:r>
+      <w:proofErr w:type="spellEnd"/>
+      <w:r>
+        <w:rPr>
+          <w:sz w:val="22"/>
+          <w:szCs w:val="22"/>
+        </w:rPr>
+        <w:t xml:space="preserve"> }</w:t>
+      </w:r>
+      <w:proofErr w:type="gramEnd"/>
+      <w:r>
+        <w:rPr>
+          <w:sz w:val="22"/>
+          <w:szCs w:val="22"/>
+        </w:rPr>
+        <w:t>}</w:t>
+      </w:r>
+    </w:p>
+    <w:p>
+      <w:pPr>
+        <w:pStyle w:val="RapportTitel"/>
+        <w:rPr>
+          <w:sz w:val="22"/>
+          <w:szCs w:val="22"/>
+        </w:rPr>
+      </w:pPr>
+    </w:p>
+    <w:p>
+      <w:pPr>
+        <w:pStyle w:val="RapportTitel"/>
         <w:rPr>
           <w:b/>
           <w:bCs/>
           <w:sz w:val="22"/>
           <w:szCs w:val="22"/>
         </w:rPr>
-        <w:t>Dimensionering og sikkerhed:</w:t>
-      </w:r>
-    </w:p>
-    <w:p>
-      <w:pPr>
-        <w:pStyle w:val="RapportTitel"/>
-        <w:rPr>
-          <w:sz w:val="22"/>
-          <w:szCs w:val="22"/>
-        </w:rPr>
-      </w:pPr>
-      <w:proofErr w:type="gramStart"/>
-      <w:r>
-        <w:rPr>
-          <w:sz w:val="22"/>
-          <w:szCs w:val="22"/>
-        </w:rPr>
-        <w:t xml:space="preserve">{{ </w:t>
-      </w:r>
-      <w:proofErr w:type="spellStart"/>
-      <w:r>
-        <w:rPr>
-          <w:sz w:val="22"/>
-          <w:szCs w:val="22"/>
-        </w:rPr>
-        <w:t>tekst</w:t>
-      </w:r>
-      <w:proofErr w:type="gramEnd"/>
-      <w:r>
-        <w:rPr>
-          <w:sz w:val="22"/>
-          <w:szCs w:val="22"/>
-        </w:rPr>
-        <w:t>_dim_</w:t>
-      </w:r>
-      <w:proofErr w:type="gramStart"/>
-      <w:r>
-        <w:rPr>
-          <w:sz w:val="22"/>
-          <w:szCs w:val="22"/>
-        </w:rPr>
-        <w:t>sikkerhed</w:t>
-      </w:r>
-      <w:proofErr w:type="spellEnd"/>
-      <w:r>
-        <w:rPr>
-          <w:sz w:val="22"/>
-          <w:szCs w:val="22"/>
-        </w:rPr>
-        <w:t xml:space="preserve"> }</w:t>
-      </w:r>
-      <w:proofErr w:type="gramEnd"/>
-      <w:r>
-        <w:rPr>
-          <w:sz w:val="22"/>
-          <w:szCs w:val="22"/>
-        </w:rPr>
-        <w:t>}</w:t>
-      </w:r>
-    </w:p>
-    <w:p>
-      <w:pPr>
-        <w:pStyle w:val="RapportTitel"/>
-        <w:rPr>
-          <w:sz w:val="22"/>
-          <w:szCs w:val="22"/>
-        </w:rPr>
-      </w:pPr>
-    </w:p>
-    <w:p>
-      <w:pPr>
-        <w:pStyle w:val="RapportTitel"/>
+      </w:pPr>
+      <w:r>
         <w:rPr>
           <w:b/>
           <w:bCs/>
           <w:sz w:val="22"/>
           <w:szCs w:val="22"/>
         </w:rPr>
-      </w:pPr>
-      <w:r>
+        <w:t>Kontrolplan:</w:t>
+      </w:r>
+    </w:p>
+    <w:p>
+      <w:pPr>
+        <w:pStyle w:val="RapportTitel"/>
+        <w:rPr>
+          <w:sz w:val="22"/>
+          <w:szCs w:val="22"/>
+        </w:rPr>
+      </w:pPr>
+      <w:proofErr w:type="gramStart"/>
+      <w:r>
+        <w:rPr>
+          <w:sz w:val="22"/>
+          <w:szCs w:val="22"/>
+        </w:rPr>
+        <w:t xml:space="preserve">{{ </w:t>
+      </w:r>
+      <w:proofErr w:type="spellStart"/>
+      <w:r>
+        <w:rPr>
+          <w:sz w:val="22"/>
+          <w:szCs w:val="22"/>
+        </w:rPr>
+        <w:t>tekst</w:t>
+      </w:r>
+      <w:proofErr w:type="gramEnd"/>
+      <w:r>
+        <w:rPr>
+          <w:sz w:val="22"/>
+          <w:szCs w:val="22"/>
+        </w:rPr>
+        <w:t>_</w:t>
+      </w:r>
+      <w:proofErr w:type="gramStart"/>
+      <w:r>
+        <w:rPr>
+          <w:sz w:val="22"/>
+          <w:szCs w:val="22"/>
+        </w:rPr>
+        <w:t>kontrolplan</w:t>
+      </w:r>
+      <w:proofErr w:type="spellEnd"/>
+      <w:r>
+        <w:rPr>
+          <w:sz w:val="22"/>
+          <w:szCs w:val="22"/>
+        </w:rPr>
+        <w:t xml:space="preserve"> }</w:t>
+      </w:r>
+      <w:proofErr w:type="gramEnd"/>
+      <w:r>
+        <w:rPr>
+          <w:sz w:val="22"/>
+          <w:szCs w:val="22"/>
+        </w:rPr>
+        <w:t>}</w:t>
+      </w:r>
+    </w:p>
+    <w:p>
+      <w:pPr>
+        <w:pStyle w:val="RapportTitel"/>
+        <w:rPr>
+          <w:sz w:val="22"/>
+          <w:szCs w:val="22"/>
+        </w:rPr>
+      </w:pPr>
+    </w:p>
+    <w:p>
+      <w:pPr>
+        <w:pStyle w:val="RapportTitel"/>
         <w:rPr>
           <w:b/>
           <w:bCs/>
           <w:sz w:val="22"/>
           <w:szCs w:val="22"/>
         </w:rPr>
-        <w:t>Udførelse:</w:t>
-      </w:r>
-    </w:p>
-    <w:p>
-      <w:pPr>
-        <w:pStyle w:val="RapportTitel"/>
-        <w:rPr>
-          <w:sz w:val="22"/>
-          <w:szCs w:val="22"/>
-        </w:rPr>
-      </w:pPr>
-      <w:proofErr w:type="gramStart"/>
-      <w:r>
-        <w:rPr>
-          <w:sz w:val="22"/>
-          <w:szCs w:val="22"/>
-        </w:rPr>
-        <w:t xml:space="preserve">{{ </w:t>
-      </w:r>
-      <w:proofErr w:type="spellStart"/>
-      <w:r>
-        <w:rPr>
-          <w:sz w:val="22"/>
-          <w:szCs w:val="22"/>
-        </w:rPr>
-        <w:t>tekst</w:t>
-      </w:r>
-      <w:proofErr w:type="gramEnd"/>
-      <w:r>
-        <w:rPr>
-          <w:sz w:val="22"/>
-          <w:szCs w:val="22"/>
-        </w:rPr>
-        <w:t>_</w:t>
-      </w:r>
-      <w:proofErr w:type="gramStart"/>
-      <w:r>
-        <w:rPr>
-          <w:sz w:val="22"/>
-          <w:szCs w:val="22"/>
-        </w:rPr>
-        <w:t>udfoerelse</w:t>
-      </w:r>
-      <w:proofErr w:type="spellEnd"/>
-      <w:r>
-        <w:rPr>
-          <w:sz w:val="22"/>
-          <w:szCs w:val="22"/>
-        </w:rPr>
-        <w:t xml:space="preserve"> }</w:t>
-      </w:r>
-      <w:proofErr w:type="gramEnd"/>
-      <w:r>
-        <w:rPr>
-          <w:sz w:val="22"/>
-          <w:szCs w:val="22"/>
-        </w:rPr>
-        <w:t>}</w:t>
-      </w:r>
-    </w:p>
-    <w:p>
-      <w:pPr>
-        <w:pStyle w:val="RapportTitel"/>
-        <w:rPr>
-          <w:sz w:val="22"/>
-          <w:szCs w:val="22"/>
-        </w:rPr>
-      </w:pPr>
-    </w:p>
-    <w:p>
-      <w:pPr>
-        <w:pStyle w:val="RapportTitel"/>
+      </w:pPr>
+      <w:r>
         <w:rPr>
           <w:b/>
           <w:bCs/>
           <w:sz w:val="22"/>
           <w:szCs w:val="22"/>
         </w:rPr>
-      </w:pPr>
+        <w:t>Projekteringsansvar</w:t>
+      </w:r>
       <w:r>
         <w:rPr>
           <w:b/>
@@ -1315,7 +1421,7 @@
           <w:sz w:val="22"/>
           <w:szCs w:val="22"/>
         </w:rPr>
-        <w:t>Kontrolplan:</w:t>
+        <w:t>:</w:t>
       </w:r>
     </w:p>
     <w:p>
@@ -1332,6 +1438,7 @@
           <w:sz w:val="22"/>
           <w:szCs w:val="22"/>
         </w:rPr>
+        <w:lastRenderedPageBreak/>
         <w:t xml:space="preserve">{{ </w:t>
       </w:r>
       <w:proofErr w:type="spellStart"/>
@@ -1356,7 +1463,7 @@
           <w:sz w:val="22"/>
           <w:szCs w:val="22"/>
         </w:rPr>
-        <w:t>kontrolplan</w:t>
+        <w:t>projekteringsansvar</w:t>
       </w:r>
       <w:proofErr w:type="spellEnd"/>
       <w:r>
@@ -1374,6 +1481,24 @@
         </w:rPr>
         <w:t>}</w:t>
       </w:r>
+    </w:p>
+    <w:p>
+      <w:pPr>
+        <w:pStyle w:val="RapportTitel"/>
+        <w:rPr>
+          <w:sz w:val="22"/>
+          <w:szCs w:val="22"/>
+        </w:rPr>
+      </w:pPr>
+    </w:p>
+    <w:p>
+      <w:pPr>
+        <w:pStyle w:val="RapportTitel"/>
+        <w:rPr>
+          <w:sz w:val="22"/>
+          <w:szCs w:val="22"/>
+        </w:rPr>
+      </w:pPr>
     </w:p>
     <w:p>
       <w:pPr>
@@ -1401,102 +1526,6 @@
           <w:sz w:val="22"/>
           <w:szCs w:val="22"/>
         </w:rPr>
-        <w:t>Projekteringsansvar</w:t>
-      </w:r>
-      <w:r>
-        <w:rPr>
-          <w:b/>
-          <w:bCs/>
-          <w:sz w:val="22"/>
-          <w:szCs w:val="22"/>
-        </w:rPr>
-        <w:t>:</w:t>
-      </w:r>
-    </w:p>
-    <w:p>
-      <w:pPr>
-        <w:pStyle w:val="RapportTitel"/>
-        <w:rPr>
-          <w:sz w:val="22"/>
-          <w:szCs w:val="22"/>
-        </w:rPr>
-      </w:pPr>
-      <w:proofErr w:type="gramStart"/>
-      <w:r>
-        <w:rPr>
-          <w:sz w:val="22"/>
-          <w:szCs w:val="22"/>
-        </w:rPr>
-        <w:t xml:space="preserve">{{ </w:t>
-      </w:r>
-      <w:proofErr w:type="spellStart"/>
-      <w:r>
-        <w:rPr>
-          <w:sz w:val="22"/>
-          <w:szCs w:val="22"/>
-        </w:rPr>
-        <w:t>tekst</w:t>
-      </w:r>
-      <w:proofErr w:type="gramEnd"/>
-      <w:r>
-        <w:rPr>
-          <w:sz w:val="22"/>
-          <w:szCs w:val="22"/>
-        </w:rPr>
-        <w:t>_</w:t>
-      </w:r>
-      <w:proofErr w:type="gramStart"/>
-      <w:r>
-        <w:rPr>
-          <w:sz w:val="22"/>
-          <w:szCs w:val="22"/>
-        </w:rPr>
-        <w:t>projekteringsansvar</w:t>
-      </w:r>
-      <w:proofErr w:type="spellEnd"/>
-      <w:r>
-        <w:rPr>
-          <w:sz w:val="22"/>
-          <w:szCs w:val="22"/>
-        </w:rPr>
-        <w:t xml:space="preserve"> }</w:t>
-      </w:r>
-      <w:proofErr w:type="gramEnd"/>
-      <w:r>
-        <w:rPr>
-          <w:sz w:val="22"/>
-          <w:szCs w:val="22"/>
-        </w:rPr>
-        <w:t>}</w:t>
-      </w:r>
-    </w:p>
-    <w:p>
-      <w:pPr>
-        <w:pStyle w:val="RapportTitel"/>
-        <w:rPr>
-          <w:sz w:val="22"/>
-          <w:szCs w:val="22"/>
-        </w:rPr>
-      </w:pPr>
-    </w:p>
-    <w:p>
-      <w:pPr>
-        <w:pStyle w:val="RapportTitel"/>
-        <w:rPr>
-          <w:b/>
-          <w:bCs/>
-          <w:sz w:val="22"/>
-          <w:szCs w:val="22"/>
-        </w:rPr>
-      </w:pPr>
-      <w:r>
-        <w:rPr>
-          <w:b/>
-          <w:bCs/>
-          <w:sz w:val="22"/>
-          <w:szCs w:val="22"/>
-        </w:rPr>
-        <w:lastRenderedPageBreak/>
         <w:t>Odense</w:t>
       </w:r>
       <w:r>
@@ -3593,7 +3622,12 @@
 </file>
 
 <file path=customXml/item2.xml><?xml version="1.0" encoding="utf-8"?>
-<b:Sources xmlns:b="http://schemas.openxmlformats.org/officeDocument/2006/bibliography" xmlns="http://schemas.openxmlformats.org/officeDocument/2006/bibliography" SelectedStyle="\APASixthEditionOfficeOnline.xsl" StyleName="APA" Version="6"/>
+<?mso-contentType ?>
+<FormTemplates xmlns="http://schemas.microsoft.com/sharepoint/v3/contenttype/forms">
+  <Display>DocumentLibraryForm</Display>
+  <Edit>DocumentLibraryForm</Edit>
+  <New>DocumentLibraryForm</New>
+</FormTemplates>
 </file>
 
 <file path=customXml/item3.xml><?xml version="1.0" encoding="utf-8"?>
@@ -3858,12 +3892,7 @@
 </file>
 
 <file path=customXml/item4.xml><?xml version="1.0" encoding="utf-8"?>
-<?mso-contentType ?>
-<FormTemplates xmlns="http://schemas.microsoft.com/sharepoint/v3/contenttype/forms">
-  <Display>DocumentLibraryForm</Display>
-  <Edit>DocumentLibraryForm</Edit>
-  <New>DocumentLibraryForm</New>
-</FormTemplates>
+<b:Sources xmlns:b="http://schemas.openxmlformats.org/officeDocument/2006/bibliography" xmlns="http://schemas.openxmlformats.org/officeDocument/2006/bibliography" SelectedStyle="\APASixthEditionOfficeOnline.xsl" StyleName="APA" Version="6"/>
 </file>
 
 <file path=customXml/itemProps1.xml><?xml version="1.0" encoding="utf-8"?>
@@ -3878,9 +3907,9 @@
 </file>
 
 <file path=customXml/itemProps2.xml><?xml version="1.0" encoding="utf-8"?>
-<ds:datastoreItem xmlns:ds="http://schemas.openxmlformats.org/officeDocument/2006/customXml" ds:itemID="{1C0F4396-7414-4761-9E29-1E7CA0E9432A}">
+<ds:datastoreItem xmlns:ds="http://schemas.openxmlformats.org/officeDocument/2006/customXml" ds:itemID="{7F7F3EE4-B827-46F8-9B41-1867DA03D8C0}">
   <ds:schemaRefs>
-    <ds:schemaRef ds:uri="http://schemas.openxmlformats.org/officeDocument/2006/bibliography"/>
+    <ds:schemaRef ds:uri="http://schemas.microsoft.com/sharepoint/v3/contenttype/forms"/>
   </ds:schemaRefs>
 </ds:datastoreItem>
 </file>
@@ -3905,9 +3934,9 @@
 </file>
 
 <file path=customXml/itemProps4.xml><?xml version="1.0" encoding="utf-8"?>
-<ds:datastoreItem xmlns:ds="http://schemas.openxmlformats.org/officeDocument/2006/customXml" ds:itemID="{7F7F3EE4-B827-46F8-9B41-1867DA03D8C0}">
+<ds:datastoreItem xmlns:ds="http://schemas.openxmlformats.org/officeDocument/2006/customXml" ds:itemID="{1C0F4396-7414-4761-9E29-1E7CA0E9432A}">
   <ds:schemaRefs>
-    <ds:schemaRef ds:uri="http://schemas.microsoft.com/sharepoint/v3/contenttype/forms"/>
+    <ds:schemaRef ds:uri="http://schemas.openxmlformats.org/officeDocument/2006/bibliography"/>
   </ds:schemaRefs>
 </ds:datastoreItem>
 </file>
</xml_diff>

<commit_message>
opdater rapportskabelon og tilfoej testrapporter
- assets/rapport_skabelon.docx opdateret
- testrapporter fra Grenaa Havn-sagen og en egen testkoersel lagt ind
- kopi af vejdim_flow.html gemt
- Excel-laasefil (~$BG designmanual ...) fjernet fra versionsstyring

Co-Authored-By: Claude Opus 5 <noreply@anthropic.com>
</commit_message>
<xml_diff>
--- a/assets/rapport_skabelon.docx
+++ b/assets/rapport_skabelon.docx
@@ -66,7 +66,14 @@
     </w:p>
     <w:p>
       <w:pPr>
+        <w:tabs>
+          <w:tab w:pos="1701" w:val="left"/>
+        </w:tabs>
+        <w:ind w:left="1701" w:hanging="1701"/>
         <w:jc w:val="both"/>
+        <w:rPr>
+          <w:bCs/>
+        </w:rPr>
       </w:pPr>
       <w:r>
         <w:rPr>
@@ -95,16 +102,66 @@
         <w:t xml:space="preserve"> }}</w:t>
       </w:r>
     </w:p>
+    <w:p>
+      <w:pPr>
+        <w:jc w:val="both"/>
+      </w:pPr>
+      <w:r>
+        <w:rPr>
+          <w:bCs/>
+        </w:rPr>
+        <w:tab/>
+      </w:r>
+    </w:p>
+    <w:p>
+      <w:pPr>
+        <w:tabs>
+          <w:tab w:pos="1701" w:val="left"/>
+        </w:tabs>
+        <w:ind w:left="1701" w:hanging="1701"/>
+        <w:jc w:val="both"/>
+      </w:pPr>
+      <w:r>
+        <w:rPr>
+          <w:b/>
+        </w:rPr>
+        <w:t xml:space="preserve">Omfang: </w:t>
+      </w:r>
+      <w:r>
+        <w:rPr>
+          <w:b/>
+        </w:rPr>
+        <w:tab/>
+      </w:r>
+      <w:proofErr w:type="gramStart"/>
+      <w:r>
+        <w:rPr>
+          <w:bCs/>
+        </w:rPr>
+        <w:t>{{ omfang</w:t>
+      </w:r>
+      <w:proofErr w:type="gramEnd"/>
+      <w:r>
+        <w:rPr>
+          <w:bCs/>
+        </w:rPr>
+        <w:t xml:space="preserve"> }}</w:t>
+      </w:r>
+    </w:p>
     <w:p/>
     <w:p>
       <w:pPr>
+        <w:tabs>
+          <w:tab w:pos="1701" w:val="left"/>
+        </w:tabs>
+        <w:ind w:left="1701" w:hanging="1701"/>
         <w:jc w:val="both"/>
       </w:pPr>
       <w:r>
         <w:rPr>
           <w:b/>
         </w:rPr>
-        <w:t xml:space="preserve">Omfang: </w:t>
+        <w:t xml:space="preserve">Udføres for: </w:t>
       </w:r>
       <w:r>
         <w:rPr>
@@ -114,29 +171,104 @@
       </w:r>
       <w:proofErr w:type="gramStart"/>
       <w:r>
-        <w:rPr>
-          <w:bCs/>
-        </w:rPr>
-        <w:t>{{ omfang</w:t>
+        <w:t xml:space="preserve">{{ </w:t>
+      </w:r>
+      <w:proofErr w:type="spellStart"/>
+      <w:r>
+        <w:t>udfoeres</w:t>
       </w:r>
       <w:proofErr w:type="gramEnd"/>
       <w:r>
-        <w:rPr>
-          <w:bCs/>
+        <w:t>_</w:t>
+      </w:r>
+      <w:proofErr w:type="gramStart"/>
+      <w:r>
+        <w:t>for</w:t>
+      </w:r>
+      <w:proofErr w:type="spellEnd"/>
+      <w:r>
+        <w:t xml:space="preserve"> }</w:t>
+      </w:r>
+      <w:proofErr w:type="gramEnd"/>
+      <w:r>
+        <w:t>}</w:t>
+      </w:r>
+    </w:p>
+    <w:p>
+      <w:pPr>
+        <w:jc w:val="both"/>
+      </w:pPr>
+    </w:p>
+    <w:p>
+      <w:pPr>
+        <w:pStyle w:val="RapportTitel"/>
+        <w:tabs>
+          <w:tab w:pos="1701" w:val="left"/>
+        </w:tabs>
+        <w:ind w:left="1701" w:hanging="1701"/>
+        <w:rPr>
+          <w:sz w:val="22"/>
+          <w:szCs w:val="22"/>
+        </w:rPr>
+      </w:pPr>
+      <w:r>
+        <w:rPr>
+          <w:b/>
+          <w:sz w:val="22"/>
+          <w:szCs w:val="22"/>
+        </w:rPr>
+        <w:t>Udført af:</w:t>
+      </w:r>
+      <w:r>
+        <w:rPr>
+          <w:b/>
+        </w:rPr>
+        <w:tab/>
+      </w:r>
+      <w:proofErr w:type="gramStart"/>
+      <w:r>
+        <w:rPr>
+          <w:sz w:val="22"/>
+          <w:szCs w:val="22"/>
+        </w:rPr>
+        <w:t>{{ sagsbehandler</w:t>
+      </w:r>
+      <w:proofErr w:type="gramEnd"/>
+      <w:r>
+        <w:rPr>
+          <w:sz w:val="22"/>
+          <w:szCs w:val="22"/>
         </w:rPr>
         <w:t xml:space="preserve"> }}</w:t>
       </w:r>
     </w:p>
-    <w:p/>
     <w:p>
       <w:pPr>
         <w:jc w:val="both"/>
-      </w:pPr>
-      <w:r>
-        <w:rPr>
-          <w:b/>
-        </w:rPr>
-        <w:t xml:space="preserve">Udføres for: </w:t>
+        <w:rPr>
+          <w:b/>
+        </w:rPr>
+      </w:pPr>
+    </w:p>
+    <w:p>
+      <w:pPr>
+        <w:tabs>
+          <w:tab w:pos="1701" w:val="left"/>
+        </w:tabs>
+        <w:ind w:left="1701" w:hanging="1701"/>
+        <w:jc w:val="both"/>
+      </w:pPr>
+      <w:r>
+        <w:rPr>
+          <w:b/>
+        </w:rPr>
+        <w:t>Kontrol</w:t>
+      </w:r>
+      <w:r>
+        <w:rPr>
+          <w:b/>
+        </w:rPr>
+        <w:t>:</w:t>
       </w:r>
       <w:r>
         <w:rPr>
@@ -146,27 +278,11 @@
       </w:r>
       <w:proofErr w:type="gramStart"/>
       <w:r>
-        <w:t xml:space="preserve">{{ </w:t>
-      </w:r>
-      <w:proofErr w:type="spellStart"/>
-      <w:r>
-        <w:t>udfoeres</w:t>
+        <w:t>{{ kontrol</w:t>
       </w:r>
       <w:proofErr w:type="gramEnd"/>
       <w:r>
-        <w:t>_</w:t>
-      </w:r>
-      <w:proofErr w:type="gramStart"/>
-      <w:r>
-        <w:t>for</w:t>
-      </w:r>
-      <w:proofErr w:type="spellEnd"/>
-      <w:r>
-        <w:t xml:space="preserve"> }</w:t>
-      </w:r>
-      <w:proofErr w:type="gramEnd"/>
-      <w:r>
-        <w:t>}</w:t>
+        <w:t xml:space="preserve"> }}</w:t>
       </w:r>
     </w:p>
     <w:p>
@@ -222,7 +338,14 @@
           <w:i/>
           <w:iCs/>
         </w:rPr>
-        <w:t>Oplyste forudsætninger:</w:t>
+        <w:t>F</w:t>
+      </w:r>
+      <w:r>
+        <w:rPr>
+          <w:i/>
+          <w:iCs/>
+        </w:rPr>
+        <w:t>orudsætninger:</w:t>
       </w:r>
     </w:p>
     <w:p>
@@ -1326,6 +1449,7 @@
           <w:sz w:val="22"/>
           <w:szCs w:val="22"/>
         </w:rPr>
+        <w:lastRenderedPageBreak/>
         <w:t>Kontrolplan:</w:t>
       </w:r>
     </w:p>
@@ -1438,7 +1562,6 @@
           <w:sz w:val="22"/>
           <w:szCs w:val="22"/>
         </w:rPr>
-        <w:lastRenderedPageBreak/>
         <w:t xml:space="preserve">{{ </w:t>
       </w:r>
       <w:proofErr w:type="spellStart"/>
@@ -3611,26 +3734,6 @@
 </file>
 
 <file path=customXml/item1.xml><?xml version="1.0" encoding="utf-8"?>
-<p:properties xmlns:p="http://schemas.microsoft.com/office/2006/metadata/properties" xmlns:xsi="http://www.w3.org/2001/XMLSchema-instance" xmlns:pc="http://schemas.microsoft.com/office/infopath/2007/PartnerControls">
-  <documentManagement>
-    <TaxCatchAll xmlns="41c9fafd-c058-44f8-b2ce-53cd3afba157" xsi:nil="true"/>
-    <lcf76f155ced4ddcb4097134ff3c332f xmlns="3c9f7625-f508-4699-980b-15a788d55c32">
-      <Terms xmlns="http://schemas.microsoft.com/office/infopath/2007/PartnerControls"/>
-    </lcf76f155ced4ddcb4097134ff3c332f>
-  </documentManagement>
-</p:properties>
-</file>
-
-<file path=customXml/item2.xml><?xml version="1.0" encoding="utf-8"?>
-<?mso-contentType ?>
-<FormTemplates xmlns="http://schemas.microsoft.com/sharepoint/v3/contenttype/forms">
-  <Display>DocumentLibraryForm</Display>
-  <Edit>DocumentLibraryForm</Edit>
-  <New>DocumentLibraryForm</New>
-</FormTemplates>
-</file>
-
-<file path=customXml/item3.xml><?xml version="1.0" encoding="utf-8"?>
 <ct:contentTypeSchema xmlns:ct="http://schemas.microsoft.com/office/2006/metadata/contentType" xmlns:ma="http://schemas.microsoft.com/office/2006/metadata/properties/metaAttributes" ct:_="" ma:_="" ma:contentTypeName="Document" ma:contentTypeID="0x010100A8CC43999E69B146B21FD7037336070D" ma:contentTypeVersion="19" ma:contentTypeDescription="Create a new document." ma:contentTypeScope="" ma:versionID="da949df7407854784e825555ef0470b6">
   <xsd:schema xmlns:xsd="http://www.w3.org/2001/XMLSchema" xmlns:xs="http://www.w3.org/2001/XMLSchema" xmlns:p="http://schemas.microsoft.com/office/2006/metadata/properties" xmlns:ns2="3c9f7625-f508-4699-980b-15a788d55c32" xmlns:ns3="41c9fafd-c058-44f8-b2ce-53cd3afba157" targetNamespace="http://schemas.microsoft.com/office/2006/metadata/properties" ma:root="true" ma:fieldsID="15818a7baaa05f324ff0ec0f28430cf1" ns2:_="" ns3:_="">
     <xsd:import namespace="3c9f7625-f508-4699-980b-15a788d55c32"/>
@@ -3891,30 +3994,31 @@
 </ct:contentTypeSchema>
 </file>
 
+<file path=customXml/item2.xml><?xml version="1.0" encoding="utf-8"?>
+<?mso-contentType ?>
+<FormTemplates xmlns="http://schemas.microsoft.com/sharepoint/v3/contenttype/forms">
+  <Display>DocumentLibraryForm</Display>
+  <Edit>DocumentLibraryForm</Edit>
+  <New>DocumentLibraryForm</New>
+</FormTemplates>
+</file>
+
+<file path=customXml/item3.xml><?xml version="1.0" encoding="utf-8"?>
+<p:properties xmlns:p="http://schemas.microsoft.com/office/2006/metadata/properties" xmlns:xsi="http://www.w3.org/2001/XMLSchema-instance" xmlns:pc="http://schemas.microsoft.com/office/infopath/2007/PartnerControls">
+  <documentManagement>
+    <TaxCatchAll xmlns="41c9fafd-c058-44f8-b2ce-53cd3afba157" xsi:nil="true"/>
+    <lcf76f155ced4ddcb4097134ff3c332f xmlns="3c9f7625-f508-4699-980b-15a788d55c32">
+      <Terms xmlns="http://schemas.microsoft.com/office/infopath/2007/PartnerControls"/>
+    </lcf76f155ced4ddcb4097134ff3c332f>
+  </documentManagement>
+</p:properties>
+</file>
+
 <file path=customXml/item4.xml><?xml version="1.0" encoding="utf-8"?>
 <b:Sources xmlns:b="http://schemas.openxmlformats.org/officeDocument/2006/bibliography" xmlns="http://schemas.openxmlformats.org/officeDocument/2006/bibliography" SelectedStyle="\APASixthEditionOfficeOnline.xsl" StyleName="APA" Version="6"/>
 </file>
 
 <file path=customXml/itemProps1.xml><?xml version="1.0" encoding="utf-8"?>
-<ds:datastoreItem xmlns:ds="http://schemas.openxmlformats.org/officeDocument/2006/customXml" ds:itemID="{DB34630C-6632-4F4A-8401-0B3C3F129E00}">
-  <ds:schemaRefs>
-    <ds:schemaRef ds:uri="http://schemas.microsoft.com/office/2006/metadata/properties"/>
-    <ds:schemaRef ds:uri="http://schemas.microsoft.com/office/infopath/2007/PartnerControls"/>
-    <ds:schemaRef ds:uri="41c9fafd-c058-44f8-b2ce-53cd3afba157"/>
-    <ds:schemaRef ds:uri="3c9f7625-f508-4699-980b-15a788d55c32"/>
-  </ds:schemaRefs>
-</ds:datastoreItem>
-</file>
-
-<file path=customXml/itemProps2.xml><?xml version="1.0" encoding="utf-8"?>
-<ds:datastoreItem xmlns:ds="http://schemas.openxmlformats.org/officeDocument/2006/customXml" ds:itemID="{7F7F3EE4-B827-46F8-9B41-1867DA03D8C0}">
-  <ds:schemaRefs>
-    <ds:schemaRef ds:uri="http://schemas.microsoft.com/sharepoint/v3/contenttype/forms"/>
-  </ds:schemaRefs>
-</ds:datastoreItem>
-</file>
-
-<file path=customXml/itemProps3.xml><?xml version="1.0" encoding="utf-8"?>
 <ds:datastoreItem xmlns:ds="http://schemas.openxmlformats.org/officeDocument/2006/customXml" ds:itemID="{3110F94B-FA03-43C1-B03B-8B3B4671D0EF}">
   <ds:schemaRefs>
     <ds:schemaRef ds:uri="http://schemas.microsoft.com/office/2006/metadata/contentType"/>
@@ -3933,6 +4037,25 @@
 </ds:datastoreItem>
 </file>
 
+<file path=customXml/itemProps2.xml><?xml version="1.0" encoding="utf-8"?>
+<ds:datastoreItem xmlns:ds="http://schemas.openxmlformats.org/officeDocument/2006/customXml" ds:itemID="{7F7F3EE4-B827-46F8-9B41-1867DA03D8C0}">
+  <ds:schemaRefs>
+    <ds:schemaRef ds:uri="http://schemas.microsoft.com/sharepoint/v3/contenttype/forms"/>
+  </ds:schemaRefs>
+</ds:datastoreItem>
+</file>
+
+<file path=customXml/itemProps3.xml><?xml version="1.0" encoding="utf-8"?>
+<ds:datastoreItem xmlns:ds="http://schemas.openxmlformats.org/officeDocument/2006/customXml" ds:itemID="{DB34630C-6632-4F4A-8401-0B3C3F129E00}">
+  <ds:schemaRefs>
+    <ds:schemaRef ds:uri="http://schemas.microsoft.com/office/2006/metadata/properties"/>
+    <ds:schemaRef ds:uri="http://schemas.microsoft.com/office/infopath/2007/PartnerControls"/>
+    <ds:schemaRef ds:uri="41c9fafd-c058-44f8-b2ce-53cd3afba157"/>
+    <ds:schemaRef ds:uri="3c9f7625-f508-4699-980b-15a788d55c32"/>
+  </ds:schemaRefs>
+</ds:datastoreItem>
+</file>
+
 <file path=customXml/itemProps4.xml><?xml version="1.0" encoding="utf-8"?>
 <ds:datastoreItem xmlns:ds="http://schemas.openxmlformats.org/officeDocument/2006/customXml" ds:itemID="{1C0F4396-7414-4761-9E29-1E7CA0E9432A}">
   <ds:schemaRefs>

</xml_diff>